<commit_message>
Rewrite Q2 against supplied correction tables A5(1)-A5(6), A6(1), and numbered Appendix 7 methods
</commit_message>
<xml_diff>
--- a/downloads/PIA5704/PIA5704_Q2_Bilingual_Answer.docx
+++ b/downloads/PIA5704/PIA5704_Q2_Bilingual_Answer.docx
@@ -22,12 +22,12 @@
     </w:p>
     <w:p>
       <w:r>
-        <w:t>工业电缆应同时适合负载、安装方式和外部环境。选择内容包括导体材料、芯数、绝缘、铠装及护套；截面则须同时满足载流量、压降、故障保护及损耗要求。额定电流相同的回路，因敷设和环境不同，所需电缆也可能不同。</w:t>
+        <w:t>工业电缆的选型包括导体材料、芯数、绝缘、铠装及护套；导体截面积则须同时满足安装后的载流量、压降、故障保护和损耗要求。相同负载在不同安装方式及散热条件下，可能需要不同的电缆规格。</w:t>
       </w:r>
     </w:p>
     <w:p>
       <w:r>
-        <w:t>Industrial cables must suit the load, installation arrangement and external environment. Selection covers conductor material, number of cores, insulation, armour and sheath. The conductor size must satisfy current-carrying capacity, voltage drop, fault protection and loss requirements together. Circuits with the same rated current may require different cables under different conditions.</w:t>
+        <w:t>Cable selection covers conductor material, number of cores, insulation, armour and sheath. Conductor size must satisfy installed current-carrying capacity, voltage drop, fault protection and loss requirements together. The same load may require different cables under different installation and heat-dissipation conditions.</w:t>
       </w:r>
     </w:p>
     <w:p>
@@ -35,7 +35,7 @@
         <w:pStyle w:val="Heading2"/>
       </w:pPr>
       <w:r>
-        <w:t>1 三组表的应用 / Applying the three table groups</w:t>
+        <w:t>1 三组表的关系 / How the three table groups work together</w:t>
       </w:r>
     </w:p>
     <w:tbl>
@@ -46,9 +46,9 @@
         <w:tblLook w:firstColumn="1" w:firstRow="1" w:lastColumn="0" w:lastRow="0" w:noHBand="0" w:noVBand="1" w:val="04A0"/>
       </w:tblPr>
       <w:tblGrid>
-        <w:gridCol w:w="2523"/>
-        <w:gridCol w:w="3005"/>
-        <w:gridCol w:w="4847"/>
+        <w:gridCol w:w="2353"/>
+        <w:gridCol w:w="3203"/>
+        <w:gridCol w:w="4876"/>
       </w:tblGrid>
       <w:tr>
         <w:trPr>
@@ -56,7 +56,7 @@
         </w:trPr>
         <w:tc>
           <w:tcPr>
-            <w:tcW w:type="dxa" w:w="2523"/>
+            <w:tcW w:type="dxa" w:w="2353"/>
             <w:shd w:fill="E7EDF2"/>
           </w:tcPr>
           <w:p>
@@ -64,13 +64,13 @@
               <w:rPr>
                 <w:b/>
               </w:rPr>
-              <w:t>题目指定的表 / Table group</w:t>
+              <w:t>表组 / Table group</w:t>
             </w:r>
           </w:p>
         </w:tc>
         <w:tc>
           <w:tcPr>
-            <w:tcW w:type="dxa" w:w="3005"/>
+            <w:tcW w:type="dxa" w:w="3203"/>
             <w:shd w:fill="E7EDF2"/>
           </w:tcPr>
           <w:p>
@@ -84,7 +84,7 @@
         </w:tc>
         <w:tc>
           <w:tcPr>
-            <w:tcW w:type="dxa" w:w="4847"/>
+            <w:tcW w:type="dxa" w:w="4876"/>
             <w:shd w:fill="E7EDF2"/>
           </w:tcPr>
           <w:p>
@@ -103,51 +103,51 @@
         </w:trPr>
         <w:tc>
           <w:tcPr>
-            <w:tcW w:type="dxa" w:w="2523"/>
+            <w:tcW w:type="dxa" w:w="2353"/>
           </w:tcPr>
           <w:p>
             <w:pPr>
-              <w:spacing w:before="60" w:after="80" w:line="259" w:lineRule="auto"/>
+              <w:spacing w:before="40" w:after="60" w:line="250" w:lineRule="auto"/>
             </w:pPr>
             <w:r>
               <w:rPr>
-                <w:sz w:val="19"/>
+                <w:sz w:val="18"/>
               </w:rPr>
-              <w:t>Cable correction factors</w:t>
+              <w:t>Appendix 7</w:t>
               <w:br/>
-              <w:t>电缆修正系数</w:t>
+              <w:t>安装方式</w:t>
             </w:r>
           </w:p>
         </w:tc>
         <w:tc>
           <w:tcPr>
-            <w:tcW w:type="dxa" w:w="3005"/>
+            <w:tcW w:type="dxa" w:w="3203"/>
           </w:tcPr>
           <w:p>
             <w:pPr>
-              <w:spacing w:before="60" w:after="80" w:line="259" w:lineRule="auto"/>
+              <w:spacing w:before="40" w:after="60" w:line="250" w:lineRule="auto"/>
             </w:pPr>
             <w:r>
               <w:rPr>
-                <w:sz w:val="19"/>
+                <w:sz w:val="18"/>
               </w:rPr>
-              <w:t>根据实际环境温度、成组及隔热条件修正表列载流量，并考虑保护器件所需的修正。</w:t>
+              <w:t>先识别现场的敷设、支承、间距及围护条件，确定相应Method编号。</w:t>
             </w:r>
           </w:p>
         </w:tc>
         <w:tc>
           <w:tcPr>
-            <w:tcW w:type="dxa" w:w="4847"/>
+            <w:tcW w:type="dxa" w:w="4876"/>
           </w:tcPr>
           <w:p>
             <w:pPr>
-              <w:spacing w:before="60" w:after="80" w:line="259" w:lineRule="auto"/>
+              <w:spacing w:before="40" w:after="60" w:line="250" w:lineRule="auto"/>
             </w:pPr>
             <w:r>
               <w:rPr>
-                <w:sz w:val="19"/>
+                <w:sz w:val="18"/>
               </w:rPr>
-              <w:t>Adjust the tabulated capacity for actual ambient temperature, grouping and thermal insulation, together with the correction required by the protective-device type.</w:t>
+              <w:t>Identify the actual installation, support, spacing and enclosure conditions and the corresponding Method number.</w:t>
             </w:r>
           </w:p>
         </w:tc>
@@ -158,51 +158,51 @@
         </w:trPr>
         <w:tc>
           <w:tcPr>
-            <w:tcW w:type="dxa" w:w="2523"/>
+            <w:tcW w:type="dxa" w:w="2353"/>
           </w:tcPr>
           <w:p>
             <w:pPr>
-              <w:spacing w:before="60" w:after="80" w:line="259" w:lineRule="auto"/>
+              <w:spacing w:before="40" w:after="60" w:line="250" w:lineRule="auto"/>
             </w:pPr>
             <w:r>
               <w:rPr>
-                <w:sz w:val="19"/>
+                <w:sz w:val="18"/>
               </w:rPr>
               <w:t>Table A6(1)</w:t>
               <w:br/>
-              <w:t>电缆载流量及压降表</w:t>
+              <w:t>载流量及压降</w:t>
             </w:r>
           </w:p>
         </w:tc>
         <w:tc>
           <w:tcPr>
-            <w:tcW w:type="dxa" w:w="3005"/>
+            <w:tcW w:type="dxa" w:w="3203"/>
           </w:tcPr>
           <w:p>
             <w:pPr>
-              <w:spacing w:before="60" w:after="80" w:line="259" w:lineRule="auto"/>
+              <w:spacing w:before="40" w:after="60" w:line="250" w:lineRule="auto"/>
             </w:pPr>
             <w:r>
               <w:rPr>
-                <w:sz w:val="19"/>
+                <w:sz w:val="18"/>
               </w:rPr>
-              <w:t>按电缆类型、截面、载流导体及对应安装栏位查载流量，并读取相应压降数据。</w:t>
+              <w:t>按适用电缆类型、截面、相制及Method栏位，读取基准载流量和压降数据。</w:t>
             </w:r>
           </w:p>
         </w:tc>
         <w:tc>
           <w:tcPr>
-            <w:tcW w:type="dxa" w:w="4847"/>
+            <w:tcW w:type="dxa" w:w="4876"/>
           </w:tcPr>
           <w:p>
             <w:pPr>
-              <w:spacing w:before="60" w:after="80" w:line="259" w:lineRule="auto"/>
+              <w:spacing w:before="40" w:after="60" w:line="250" w:lineRule="auto"/>
             </w:pPr>
             <w:r>
               <w:rPr>
-                <w:sz w:val="19"/>
+                <w:sz w:val="18"/>
               </w:rPr>
-              <w:t>Provides current-carrying capacities and voltage-drop data for the stated cable type, cross-section, conductor arrangement and installation column.</w:t>
+              <w:t>Read the base capacity and voltage-drop data for the cable type, cross-section, phase arrangement and Method column.</w:t>
             </w:r>
           </w:p>
         </w:tc>
@@ -213,51 +213,51 @@
         </w:trPr>
         <w:tc>
           <w:tcPr>
-            <w:tcW w:type="dxa" w:w="2523"/>
+            <w:tcW w:type="dxa" w:w="2353"/>
           </w:tcPr>
           <w:p>
             <w:pPr>
-              <w:spacing w:before="60" w:after="80" w:line="259" w:lineRule="auto"/>
+              <w:spacing w:before="40" w:after="60" w:line="250" w:lineRule="auto"/>
             </w:pPr>
             <w:r>
               <w:rPr>
-                <w:sz w:val="19"/>
+                <w:sz w:val="18"/>
               </w:rPr>
-              <w:t>Appendix 7</w:t>
+              <w:t>Tables A5(1)–A5(6)</w:t>
               <w:br/>
-              <w:t>电缆安装方式</w:t>
+              <w:t>修正系数</w:t>
             </w:r>
           </w:p>
         </w:tc>
         <w:tc>
           <w:tcPr>
-            <w:tcW w:type="dxa" w:w="3005"/>
+            <w:tcW w:type="dxa" w:w="3203"/>
           </w:tcPr>
           <w:p>
             <w:pPr>
-              <w:spacing w:before="60" w:after="80" w:line="259" w:lineRule="auto"/>
+              <w:spacing w:before="40" w:after="60" w:line="250" w:lineRule="auto"/>
             </w:pPr>
             <w:r>
               <w:rPr>
-                <w:sz w:val="19"/>
+                <w:sz w:val="18"/>
               </w:rPr>
-              <w:t>将现场实际安装情况对应到参考安装方法，使查表条件与实际布置相符。</w:t>
+              <w:t>按温度、成组、隔热、保护器件及地沟条件，采用适用的修正及表注。</w:t>
             </w:r>
           </w:p>
         </w:tc>
         <w:tc>
           <w:tcPr>
-            <w:tcW w:type="dxa" w:w="4847"/>
+            <w:tcW w:type="dxa" w:w="4876"/>
           </w:tcPr>
           <w:p>
             <w:pPr>
-              <w:spacing w:before="60" w:after="80" w:line="259" w:lineRule="auto"/>
+              <w:spacing w:before="40" w:after="60" w:line="250" w:lineRule="auto"/>
             </w:pPr>
             <w:r>
               <w:rPr>
-                <w:sz w:val="19"/>
+                <w:sz w:val="18"/>
               </w:rPr>
-              <w:t>Matches the actual arrangement to a reference installation method so that the rating column corresponds to the installation.</w:t>
+              <w:t>Apply the relevant temperature, grouping, insulation, protective-device and trench corrections, including their notes.</w:t>
             </w:r>
           </w:p>
         </w:tc>
@@ -268,40 +268,7 @@
         <w:pStyle w:val="Heading2"/>
       </w:pPr>
       <w:r>
-        <w:t>Table A6(1) 的适用条件 / Scope of Table A6(1)</w:t>
-      </w:r>
-    </w:p>
-    <w:p>
-      <w:r>
-        <w:t>Table A6(1)适用于铜导体、单芯、PVC绝缘、非铠装电缆，可带或不带护套；表列参考环境温度为30°C，导体运行温度为70°C。查表时还须匹配单相或三相、载流导体数量及安装条件。</w:t>
-      </w:r>
-    </w:p>
-    <w:p>
-      <w:r>
-        <w:t>Table A6(1) covers single-core, PVC-insulated, non-armoured copper cables, with or without sheath, at a reference ambient temperature of 30°C and conductor operating temperature of 70°C. The phase arrangement, number of loaded conductors and installation conditions must also match.</w:t>
-      </w:r>
-    </w:p>
-    <w:p>
-      <w:r>
-        <w:t>采用铝导体、多芯、XLPE绝缘或铠装结构时，应选择相应类别的额定资料；再结合适用的修正系数及压降数据确定截面。</w:t>
-      </w:r>
-    </w:p>
-    <w:p>
-      <w:r>
-        <w:t>For aluminium, multicore, XLPE-insulated or armoured constructions, use the corresponding rating data, then apply the relevant corrections and voltage-drop checks to determine the size.</w:t>
-      </w:r>
-    </w:p>
-    <w:p>
-      <w:r>
-        <w:br w:type="page"/>
-      </w:r>
-    </w:p>
-    <w:p>
-      <w:pPr>
-        <w:pStyle w:val="Heading1"/>
-      </w:pPr>
-      <w:r>
-        <w:t>2 负载及电缆结构 / Loading and cable construction</w:t>
+        <w:t>2 负载及电缆基本选型 / Load and basic cable selection</w:t>
       </w:r>
     </w:p>
     <w:tbl>
@@ -312,9 +279,9 @@
         <w:tblLook w:firstColumn="1" w:firstRow="1" w:lastColumn="0" w:lastRow="0" w:noHBand="0" w:noVBand="1" w:val="04A0"/>
       </w:tblPr>
       <w:tblGrid>
-        <w:gridCol w:w="2523"/>
-        <w:gridCol w:w="3005"/>
-        <w:gridCol w:w="4847"/>
+        <w:gridCol w:w="2353"/>
+        <w:gridCol w:w="3203"/>
+        <w:gridCol w:w="4876"/>
       </w:tblGrid>
       <w:tr>
         <w:trPr>
@@ -322,7 +289,7 @@
         </w:trPr>
         <w:tc>
           <w:tcPr>
-            <w:tcW w:type="dxa" w:w="2523"/>
+            <w:tcW w:type="dxa" w:w="2353"/>
             <w:shd w:fill="E7EDF2"/>
           </w:tcPr>
           <w:p>
@@ -336,7 +303,7 @@
         </w:tc>
         <w:tc>
           <w:tcPr>
-            <w:tcW w:type="dxa" w:w="3005"/>
+            <w:tcW w:type="dxa" w:w="3203"/>
             <w:shd w:fill="E7EDF2"/>
           </w:tcPr>
           <w:p>
@@ -350,7 +317,7 @@
         </w:tc>
         <w:tc>
           <w:tcPr>
-            <w:tcW w:type="dxa" w:w="4847"/>
+            <w:tcW w:type="dxa" w:w="4876"/>
             <w:shd w:fill="E7EDF2"/>
           </w:tcPr>
           <w:p>
@@ -369,17 +336,17 @@
         </w:trPr>
         <w:tc>
           <w:tcPr>
-            <w:tcW w:type="dxa" w:w="2523"/>
+            <w:tcW w:type="dxa" w:w="2353"/>
           </w:tcPr>
           <w:p>
             <w:pPr>
-              <w:spacing w:before="60" w:after="80" w:line="259" w:lineRule="auto"/>
+              <w:spacing w:before="40" w:after="60" w:line="250" w:lineRule="auto"/>
             </w:pPr>
             <w:r>
               <w:rPr>
-                <w:sz w:val="19"/>
+                <w:sz w:val="18"/>
               </w:rPr>
-              <w:t>1 Design current (Ib)</w:t>
+              <w:t>Design current (Ib)</w:t>
               <w:br/>
               <w:t>设计电流</w:t>
             </w:r>
@@ -387,33 +354,33 @@
         </w:tc>
         <w:tc>
           <w:tcPr>
-            <w:tcW w:type="dxa" w:w="3005"/>
+            <w:tcW w:type="dxa" w:w="3203"/>
           </w:tcPr>
           <w:p>
             <w:pPr>
-              <w:spacing w:before="60" w:after="80" w:line="259" w:lineRule="auto"/>
+              <w:spacing w:before="40" w:after="60" w:line="250" w:lineRule="auto"/>
             </w:pPr>
             <w:r>
               <w:rPr>
-                <w:sz w:val="19"/>
+                <w:sz w:val="18"/>
               </w:rPr>
-              <w:t>应按实际机械设备、最大需量、同时使用情况和工作周期确定设计电流，并考虑功率因数及效率。电动机启动还须检查短时电流和启动压降，保护特性应适合启动过程。</w:t>
+              <w:t>按工业设备实际负载、最大需量、同时使用情况及工作周期确定，并考虑功率因数和效率。电动机启动还须核查短时电流、启动压降及保护特性。</w:t>
             </w:r>
           </w:p>
         </w:tc>
         <w:tc>
           <w:tcPr>
-            <w:tcW w:type="dxa" w:w="4847"/>
+            <w:tcW w:type="dxa" w:w="4876"/>
           </w:tcPr>
           <w:p>
             <w:pPr>
-              <w:spacing w:before="60" w:after="80" w:line="259" w:lineRule="auto"/>
+              <w:spacing w:before="40" w:after="60" w:line="250" w:lineRule="auto"/>
             </w:pPr>
             <w:r>
               <w:rPr>
-                <w:sz w:val="19"/>
+                <w:sz w:val="18"/>
               </w:rPr>
-              <w:t>Determine Ib from actual machinery loads, maximum demand, simultaneous operation and duty cycle, allowing for power factor and efficiency. For motors, also check short-duration starting current and starting voltage drop, and select protection suited to starting.</w:t>
+              <w:t>Establish Ib from actual plant loads, maximum demand, simultaneous operation and duty cycle, allowing for power factor and efficiency. Motor circuits also need checks of starting current, starting voltage drop and protective-device characteristics.</w:t>
             </w:r>
           </w:p>
         </w:tc>
@@ -424,51 +391,51 @@
         </w:trPr>
         <w:tc>
           <w:tcPr>
-            <w:tcW w:type="dxa" w:w="2523"/>
+            <w:tcW w:type="dxa" w:w="2353"/>
           </w:tcPr>
           <w:p>
             <w:pPr>
-              <w:spacing w:before="60" w:after="80" w:line="259" w:lineRule="auto"/>
+              <w:spacing w:before="40" w:after="60" w:line="250" w:lineRule="auto"/>
             </w:pPr>
             <w:r>
               <w:rPr>
-                <w:sz w:val="19"/>
+                <w:sz w:val="18"/>
               </w:rPr>
-              <w:t>2 Conductor material</w:t>
+              <w:t>Cable construction</w:t>
               <w:br/>
-              <w:t>导体材料</w:t>
+              <w:t>电缆结构</w:t>
             </w:r>
           </w:p>
         </w:tc>
         <w:tc>
           <w:tcPr>
-            <w:tcW w:type="dxa" w:w="3005"/>
+            <w:tcW w:type="dxa" w:w="3203"/>
           </w:tcPr>
           <w:p>
             <w:pPr>
-              <w:spacing w:before="60" w:after="80" w:line="259" w:lineRule="auto"/>
+              <w:spacing w:before="40" w:after="60" w:line="250" w:lineRule="auto"/>
             </w:pPr>
             <w:r>
               <w:rPr>
-                <w:sz w:val="19"/>
+                <w:sz w:val="18"/>
               </w:rPr>
-              <w:t>铜和铝的电阻率、机械特性及连接要求不同。同等负载和安装条件下，铝导体通常需要较大的截面积；还须兼顾重量、成本及接线端子的适配。</w:t>
+              <w:t>铜与铝、单芯与多芯、PVC与XLPE，以及铠装和护套均影响适用表格及环境性能。电缆额定电压也须适合供电系统；接线端子的温度和连接要求同样需要满足。</w:t>
             </w:r>
           </w:p>
         </w:tc>
         <w:tc>
           <w:tcPr>
-            <w:tcW w:type="dxa" w:w="4847"/>
+            <w:tcW w:type="dxa" w:w="4876"/>
           </w:tcPr>
           <w:p>
             <w:pPr>
-              <w:spacing w:before="60" w:after="80" w:line="259" w:lineRule="auto"/>
+              <w:spacing w:before="40" w:after="60" w:line="250" w:lineRule="auto"/>
             </w:pPr>
             <w:r>
               <w:rPr>
-                <w:sz w:val="19"/>
+                <w:sz w:val="18"/>
               </w:rPr>
-              <w:t>Copper and aluminium have different resistivity, mechanical properties and connection requirements. Aluminium generally requires a larger cross-sectional area for comparable loading and installation conditions. Weight, cost and terminal compatibility also affect the choice.</w:t>
+              <w:t>Conductor material, core construction, insulation, armour and sheath govern the applicable rating data and environmental suitability. The voltage rating must suit the system, and terminal temperature and connection requirements must also be met.</w:t>
             </w:r>
           </w:p>
         </w:tc>
@@ -479,216 +446,51 @@
         </w:trPr>
         <w:tc>
           <w:tcPr>
-            <w:tcW w:type="dxa" w:w="2523"/>
+            <w:tcW w:type="dxa" w:w="2353"/>
           </w:tcPr>
           <w:p>
             <w:pPr>
-              <w:spacing w:before="60" w:after="80" w:line="259" w:lineRule="auto"/>
+              <w:spacing w:before="40" w:after="60" w:line="250" w:lineRule="auto"/>
             </w:pPr>
             <w:r>
               <w:rPr>
-                <w:sz w:val="19"/>
+                <w:sz w:val="18"/>
               </w:rPr>
-              <w:t>3 Insulation type and operating temperature</w:t>
+              <w:t>Loaded conductors</w:t>
               <w:br/>
-              <w:t>绝缘类型及运行温度</w:t>
+              <w:t>载流导体及排列</w:t>
             </w:r>
           </w:p>
         </w:tc>
         <w:tc>
           <w:tcPr>
-            <w:tcW w:type="dxa" w:w="3005"/>
+            <w:tcW w:type="dxa" w:w="3203"/>
           </w:tcPr>
           <w:p>
             <w:pPr>
-              <w:spacing w:before="60" w:after="80" w:line="259" w:lineRule="auto"/>
+              <w:spacing w:before="40" w:after="60" w:line="250" w:lineRule="auto"/>
             </w:pPr>
             <w:r>
               <w:rPr>
-                <w:sz w:val="19"/>
+                <w:sz w:val="18"/>
               </w:rPr>
-              <w:t>PVC与XLPE的允许导体温度不同，应按选用的绝缘类型查表。较高的绝缘温度等级还须与接线端子及设备的温度限值协调，不能仅凭绝缘类型提高整条回路的载流量。</w:t>
+              <w:t>须区分单相、三相和直流，以及表内2根或3／4根导体条件。平面排列、三叶排列、接触或分隔敷设会改变散热及交流电抗。非线性负载的中性导体电流亦须评估。</w:t>
             </w:r>
           </w:p>
         </w:tc>
         <w:tc>
           <w:tcPr>
-            <w:tcW w:type="dxa" w:w="4847"/>
+            <w:tcW w:type="dxa" w:w="4876"/>
           </w:tcPr>
           <w:p>
             <w:pPr>
-              <w:spacing w:before="60" w:after="80" w:line="259" w:lineRule="auto"/>
+              <w:spacing w:before="40" w:after="60" w:line="250" w:lineRule="auto"/>
             </w:pPr>
             <w:r>
               <w:rPr>
-                <w:sz w:val="19"/>
+                <w:sz w:val="18"/>
               </w:rPr>
-              <w:t>Select the rating table for the actual insulation, such as PVC or XLPE. Its permissible conductor temperature must also be compatible with terminals and connected equipment; a higher insulation temperature rating alone does not establish a higher rating for the complete circuit.</w:t>
-            </w:r>
-          </w:p>
-        </w:tc>
-      </w:tr>
-      <w:tr>
-        <w:trPr>
-          <w:cantSplit/>
-        </w:trPr>
-        <w:tc>
-          <w:tcPr>
-            <w:tcW w:type="dxa" w:w="2523"/>
-          </w:tcPr>
-          <w:p>
-            <w:pPr>
-              <w:spacing w:before="60" w:after="80" w:line="259" w:lineRule="auto"/>
-            </w:pPr>
-            <w:r>
-              <w:rPr>
-                <w:sz w:val="19"/>
-              </w:rPr>
-              <w:t>4 Number of cores and circuit arrangement</w:t>
-              <w:br/>
-              <w:t>芯数及回路排列</w:t>
-            </w:r>
-          </w:p>
-        </w:tc>
-        <w:tc>
-          <w:tcPr>
-            <w:tcW w:type="dxa" w:w="3005"/>
-          </w:tcPr>
-          <w:p>
-            <w:pPr>
-              <w:spacing w:before="60" w:after="80" w:line="259" w:lineRule="auto"/>
-            </w:pPr>
-            <w:r>
-              <w:rPr>
-                <w:sz w:val="19"/>
-              </w:rPr>
-              <w:t>单芯或多芯、单相或三相、实际载流导体数量及排列都会影响发热和查表栏位。非线性工业负载还可能使中性导体承受明显谐波电流，其发热和截面应单独评估。</w:t>
-            </w:r>
-          </w:p>
-        </w:tc>
-        <w:tc>
-          <w:tcPr>
-            <w:tcW w:type="dxa" w:w="4847"/>
-          </w:tcPr>
-          <w:p>
-            <w:pPr>
-              <w:spacing w:before="60" w:after="80" w:line="259" w:lineRule="auto"/>
-            </w:pPr>
-            <w:r>
-              <w:rPr>
-                <w:sz w:val="19"/>
-              </w:rPr>
-              <w:t>Single-core or multicore construction, phase arrangement, the number of loaded conductors and their disposition affect heating and the applicable table column. Nonlinear industrial loads may also produce significant neutral harmonic current, requiring assessment of neutral heating and size.</w:t>
-            </w:r>
-          </w:p>
-        </w:tc>
-      </w:tr>
-      <w:tr>
-        <w:trPr>
-          <w:cantSplit/>
-        </w:trPr>
-        <w:tc>
-          <w:tcPr>
-            <w:tcW w:type="dxa" w:w="2523"/>
-          </w:tcPr>
-          <w:p>
-            <w:pPr>
-              <w:spacing w:before="60" w:after="80" w:line="259" w:lineRule="auto"/>
-            </w:pPr>
-            <w:r>
-              <w:rPr>
-                <w:sz w:val="19"/>
-              </w:rPr>
-              <w:t>5 Armour and sheath</w:t>
-              <w:br/>
-              <w:t>铠装及护套</w:t>
-            </w:r>
-          </w:p>
-        </w:tc>
-        <w:tc>
-          <w:tcPr>
-            <w:tcW w:type="dxa" w:w="3005"/>
-          </w:tcPr>
-          <w:p>
-            <w:pPr>
-              <w:spacing w:before="60" w:after="80" w:line="259" w:lineRule="auto"/>
-            </w:pPr>
-            <w:r>
-              <w:rPr>
-                <w:sz w:val="19"/>
-              </w:rPr>
-              <w:t>应按机械防护、潮湿及腐蚀等条件选择铠装和护套，并使用对应电缆结构的额定资料。交流单芯电缆的铠装及金属附件还须考虑磁性发热。</w:t>
-            </w:r>
-          </w:p>
-        </w:tc>
-        <w:tc>
-          <w:tcPr>
-            <w:tcW w:type="dxa" w:w="4847"/>
-          </w:tcPr>
-          <w:p>
-            <w:pPr>
-              <w:spacing w:before="60" w:after="80" w:line="259" w:lineRule="auto"/>
-            </w:pPr>
-            <w:r>
-              <w:rPr>
-                <w:sz w:val="19"/>
-              </w:rPr>
-              <w:t>Choose armour and sheath for the mechanical, moisture and corrosive conditions, using rating data for that cable construction. For single-core a.c. cables, the armour and associated metalwork must also be suitable for the magnetic heating effects of that arrangement.</w:t>
-            </w:r>
-          </w:p>
-        </w:tc>
-      </w:tr>
-      <w:tr>
-        <w:trPr>
-          <w:cantSplit/>
-        </w:trPr>
-        <w:tc>
-          <w:tcPr>
-            <w:tcW w:type="dxa" w:w="2523"/>
-          </w:tcPr>
-          <w:p>
-            <w:pPr>
-              <w:spacing w:before="60" w:after="80" w:line="259" w:lineRule="auto"/>
-            </w:pPr>
-            <w:r>
-              <w:rPr>
-                <w:sz w:val="19"/>
-              </w:rPr>
-              <w:t>6 Voltage rating and supply system</w:t>
-              <w:br/>
-              <w:t>额定电压及供电系统</w:t>
-            </w:r>
-          </w:p>
-        </w:tc>
-        <w:tc>
-          <w:tcPr>
-            <w:tcW w:type="dxa" w:w="3005"/>
-          </w:tcPr>
-          <w:p>
-            <w:pPr>
-              <w:spacing w:before="60" w:after="80" w:line="259" w:lineRule="auto"/>
-            </w:pPr>
-            <w:r>
-              <w:rPr>
-                <w:sz w:val="19"/>
-              </w:rPr>
-              <w:t>电缆的额定电压应适合系统电压和对地电压。交流或直流、单相或三相及负载功率因数，亦决定设计电流、导体配置和压降数据的选择。</w:t>
-            </w:r>
-          </w:p>
-        </w:tc>
-        <w:tc>
-          <w:tcPr>
-            <w:tcW w:type="dxa" w:w="4847"/>
-          </w:tcPr>
-          <w:p>
-            <w:pPr>
-              <w:spacing w:before="60" w:after="80" w:line="259" w:lineRule="auto"/>
-            </w:pPr>
-            <w:r>
-              <w:rPr>
-                <w:sz w:val="19"/>
-              </w:rPr>
-              <w:t>The cable voltage rating must suit the system voltage and voltage to earth. A.c. or d.c. operation, phase arrangement and load power factor also govern design current, conductor configuration and selection of voltage-drop data.</w:t>
+              <w:t>Distinguish single-phase, three-phase and d.c. circuits and the stated two- or three/four-conductor arrangements. Flat, trefoil, touching and spaced arrangements affect cooling and a.c. reactance. Neutral current from nonlinear loads also requires assessment.</w:t>
             </w:r>
           </w:p>
         </w:tc>
@@ -704,7 +506,7 @@
         <w:pStyle w:val="Heading1"/>
       </w:pPr>
       <w:r>
-        <w:t>3 安装条件及载流量 / Installation and current-carrying capacity</w:t>
+        <w:t>3 环境温度及成组修正 / Ambient temperature and grouping</w:t>
       </w:r>
     </w:p>
     <w:tbl>
@@ -715,9 +517,9 @@
         <w:tblLook w:firstColumn="1" w:firstRow="1" w:lastColumn="0" w:lastRow="0" w:noHBand="0" w:noVBand="1" w:val="04A0"/>
       </w:tblPr>
       <w:tblGrid>
-        <w:gridCol w:w="2523"/>
-        <w:gridCol w:w="3005"/>
-        <w:gridCol w:w="4847"/>
+        <w:gridCol w:w="2353"/>
+        <w:gridCol w:w="3203"/>
+        <w:gridCol w:w="4876"/>
       </w:tblGrid>
       <w:tr>
         <w:trPr>
@@ -725,7 +527,7 @@
         </w:trPr>
         <w:tc>
           <w:tcPr>
-            <w:tcW w:type="dxa" w:w="2523"/>
+            <w:tcW w:type="dxa" w:w="2353"/>
             <w:shd w:fill="E7EDF2"/>
           </w:tcPr>
           <w:p>
@@ -739,7 +541,7 @@
         </w:tc>
         <w:tc>
           <w:tcPr>
-            <w:tcW w:type="dxa" w:w="3005"/>
+            <w:tcW w:type="dxa" w:w="3203"/>
             <w:shd w:fill="E7EDF2"/>
           </w:tcPr>
           <w:p>
@@ -753,7 +555,7 @@
         </w:tc>
         <w:tc>
           <w:tcPr>
-            <w:tcW w:type="dxa" w:w="4847"/>
+            <w:tcW w:type="dxa" w:w="4876"/>
             <w:shd w:fill="E7EDF2"/>
           </w:tcPr>
           <w:p>
@@ -772,51 +574,51 @@
         </w:trPr>
         <w:tc>
           <w:tcPr>
-            <w:tcW w:type="dxa" w:w="2523"/>
+            <w:tcW w:type="dxa" w:w="2353"/>
           </w:tcPr>
           <w:p>
             <w:pPr>
-              <w:spacing w:before="30" w:after="50" w:line="247" w:lineRule="auto"/>
+              <w:spacing w:before="40" w:after="60" w:line="250" w:lineRule="auto"/>
             </w:pPr>
             <w:r>
               <w:rPr>
                 <w:sz w:val="18"/>
               </w:rPr>
-              <w:t>7 Installation methods</w:t>
+              <w:t>Table A5(1)</w:t>
               <w:br/>
-              <w:t>安装方式</w:t>
+              <w:t>一般温度修正</w:t>
             </w:r>
           </w:p>
         </w:tc>
         <w:tc>
           <w:tcPr>
-            <w:tcW w:type="dxa" w:w="3005"/>
+            <w:tcW w:type="dxa" w:w="3203"/>
           </w:tcPr>
           <w:p>
             <w:pPr>
-              <w:spacing w:before="30" w:after="50" w:line="247" w:lineRule="auto"/>
+              <w:spacing w:before="40" w:after="60" w:line="250" w:lineRule="auto"/>
             </w:pPr>
             <w:r>
               <w:rPr>
                 <w:sz w:val="18"/>
               </w:rPr>
-              <w:t>应按Appendix 7识别实际安装情况，再选对应参考方法。穿管、线槽、直接固定、桥架或自由空气的散热条件不同。同一线路须检查限制载流量的区段；封闭地沟或地板混凝土槽还可能需要专用修正。</w:t>
+              <w:t>环境越热，导体可用的温升余量越小，通常须降低载流量或增大截面。按绝缘种类、运行温度及实际最高环境温度选择Ca。仅作短路保护时查A5(1)；兼作过载保护时，除BS 3036半封闭熔断器外也采用A5(1)。</w:t>
             </w:r>
           </w:p>
         </w:tc>
         <w:tc>
           <w:tcPr>
-            <w:tcW w:type="dxa" w:w="4847"/>
+            <w:tcW w:type="dxa" w:w="4876"/>
           </w:tcPr>
           <w:p>
             <w:pPr>
-              <w:spacing w:before="30" w:after="50" w:line="247" w:lineRule="auto"/>
+              <w:spacing w:before="40" w:after="60" w:line="250" w:lineRule="auto"/>
             </w:pPr>
             <w:r>
               <w:rPr>
                 <w:sz w:val="18"/>
               </w:rPr>
-              <w:t>Identify the actual arrangement in Appendix 7 and use the corresponding reference method. Conduit, trunking, clipped-direct, tray and free-air installations dissipate heat differently. Assess the limiting route section; enclosed trenches or infloor concrete troughs may also require specific rating factors.</w:t>
+              <w:t>Higher ambient temperature reduces the available temperature-rise margin, normally requiring derating or a larger conductor. Select Ca for the insulation, operating temperature and expected ambient temperature. A5(1) applies to short-circuit-only protection and also to overload protection, except where a BS 3036 semi-enclosed fuse is used.</w:t>
             </w:r>
           </w:p>
         </w:tc>
@@ -827,51 +629,51 @@
         </w:trPr>
         <w:tc>
           <w:tcPr>
-            <w:tcW w:type="dxa" w:w="2523"/>
+            <w:tcW w:type="dxa" w:w="2353"/>
           </w:tcPr>
           <w:p>
             <w:pPr>
-              <w:spacing w:before="30" w:after="50" w:line="247" w:lineRule="auto"/>
+              <w:spacing w:before="40" w:after="60" w:line="250" w:lineRule="auto"/>
             </w:pPr>
             <w:r>
               <w:rPr>
                 <w:sz w:val="18"/>
               </w:rPr>
-              <w:t>8 Ambient temperature (Ca)</w:t>
+              <w:t>Table A5(2)</w:t>
               <w:br/>
-              <w:t>环境温度修正系数</w:t>
+              <w:t>半封闭熔断器的温度修正</w:t>
             </w:r>
           </w:p>
         </w:tc>
         <w:tc>
           <w:tcPr>
-            <w:tcW w:type="dxa" w:w="3005"/>
+            <w:tcW w:type="dxa" w:w="3203"/>
           </w:tcPr>
           <w:p>
             <w:pPr>
-              <w:spacing w:before="30" w:after="50" w:line="247" w:lineRule="auto"/>
+              <w:spacing w:before="40" w:after="60" w:line="250" w:lineRule="auto"/>
             </w:pPr>
             <w:r>
               <w:rPr>
                 <w:sz w:val="18"/>
               </w:rPr>
-              <w:t>应采用路线中实际可能出现的环境温度，例如炉旁或高温厂房区域。环境越热，导体可利用的温升余量越小，Ca通常越低，因而可能需要增大截面或改善路线。</w:t>
+              <w:t>当BS 3036半封闭熔断器承担过载保护时，应按A5(2)选择温度修正。温度表的选择与A5(5)的保护器件类型修正应分别考虑，并满足各自适用条件。</w:t>
             </w:r>
           </w:p>
         </w:tc>
         <w:tc>
           <w:tcPr>
-            <w:tcW w:type="dxa" w:w="4847"/>
+            <w:tcW w:type="dxa" w:w="4876"/>
           </w:tcPr>
           <w:p>
             <w:pPr>
-              <w:spacing w:before="30" w:after="50" w:line="247" w:lineRule="auto"/>
+              <w:spacing w:before="40" w:after="60" w:line="250" w:lineRule="auto"/>
             </w:pPr>
             <w:r>
               <w:rPr>
                 <w:sz w:val="18"/>
               </w:rPr>
-              <w:t>Use the ambient temperature expected along the route, including hot production areas or locations near furnaces. Higher ambient temperature reduces the available temperature-rise margin and normally lowers Ca, potentially requiring a larger conductor or a better route.</w:t>
+              <w:t>When a BS 3036 semi-enclosed fuse provides overload protection, select its temperature correction from A5(2). Selection of the temperature table and the protective-device correction in A5(5) are separate decisions, each subject to its stated conditions.</w:t>
             </w:r>
           </w:p>
         </w:tc>
@@ -882,51 +684,51 @@
         </w:trPr>
         <w:tc>
           <w:tcPr>
-            <w:tcW w:type="dxa" w:w="2523"/>
+            <w:tcW w:type="dxa" w:w="2353"/>
           </w:tcPr>
           <w:p>
             <w:pPr>
-              <w:spacing w:before="30" w:after="50" w:line="247" w:lineRule="auto"/>
+              <w:spacing w:before="40" w:after="60" w:line="250" w:lineRule="auto"/>
             </w:pPr>
             <w:r>
               <w:rPr>
                 <w:sz w:val="18"/>
               </w:rPr>
-              <w:t>9 Grouping (Cg)</w:t>
+              <w:t>Table A5(3)</w:t>
               <w:br/>
-              <w:t>成组修正系数</w:t>
+              <w:t>成组数量及敷设排列</w:t>
             </w:r>
           </w:p>
         </w:tc>
         <w:tc>
           <w:tcPr>
-            <w:tcW w:type="dxa" w:w="3005"/>
+            <w:tcW w:type="dxa" w:w="3203"/>
           </w:tcPr>
           <w:p>
             <w:pPr>
-              <w:spacing w:before="30" w:after="50" w:line="247" w:lineRule="auto"/>
+              <w:spacing w:before="40" w:after="60" w:line="250" w:lineRule="auto"/>
             </w:pPr>
             <w:r>
               <w:rPr>
                 <w:sz w:val="18"/>
               </w:rPr>
-              <w:t>多条同时带载回路在管槽内或成束敷设，会互相加热并降低每条电缆的载流量。应按回路数量、排列和间距选择Cg；分开敷设或增加间距可改善散热。</w:t>
+              <w:t>多回路同时带载会互相加热。Cg取决于回路或多芯电缆数量、围护、单层排列、桥架方向及接触或分隔情况。例如表中围护或成束情况，2回路为0.80，4回路为0.65，说明相同截面可用载流量随成组增加而下降。</w:t>
             </w:r>
           </w:p>
         </w:tc>
         <w:tc>
           <w:tcPr>
-            <w:tcW w:type="dxa" w:w="4847"/>
+            <w:tcW w:type="dxa" w:w="4876"/>
           </w:tcPr>
           <w:p>
             <w:pPr>
-              <w:spacing w:before="30" w:after="50" w:line="247" w:lineRule="auto"/>
+              <w:spacing w:before="40" w:after="60" w:line="250" w:lineRule="auto"/>
             </w:pPr>
             <w:r>
               <w:rPr>
                 <w:sz w:val="18"/>
               </w:rPr>
-              <w:t>Loaded circuits grouped in an enclosure or bunched together heat one another and reduce each cable’s capacity. Select Cg for the number of circuits, arrangement and spacing. Separating circuits or increasing spacing can improve heat dissipation.</w:t>
+              <w:t>Loaded circuits heat one another. Cg depends on circuit or multicore-cable count, enclosure, layer arrangement, tray orientation and spacing. For the enclosed or bunched arrangement shown, the factors are 0.80 for two circuits and 0.65 for four, illustrating the reduction in available capacity.</w:t>
             </w:r>
           </w:p>
         </w:tc>
@@ -937,106 +739,51 @@
         </w:trPr>
         <w:tc>
           <w:tcPr>
-            <w:tcW w:type="dxa" w:w="2523"/>
+            <w:tcW w:type="dxa" w:w="2353"/>
           </w:tcPr>
           <w:p>
             <w:pPr>
-              <w:spacing w:before="30" w:after="50" w:line="247" w:lineRule="auto"/>
+              <w:spacing w:before="40" w:after="60" w:line="250" w:lineRule="auto"/>
             </w:pPr>
             <w:r>
               <w:rPr>
                 <w:sz w:val="18"/>
               </w:rPr>
-              <w:t>10 Thermal insulation (Ci)</w:t>
+              <w:t>Cable spacing</w:t>
               <w:br/>
-              <w:t>隔热修正系数</w:t>
+              <w:t>电缆间距</w:t>
             </w:r>
           </w:p>
         </w:tc>
         <w:tc>
           <w:tcPr>
-            <w:tcW w:type="dxa" w:w="3005"/>
+            <w:tcW w:type="dxa" w:w="3203"/>
           </w:tcPr>
           <w:p>
             <w:pPr>
-              <w:spacing w:before="30" w:after="50" w:line="247" w:lineRule="auto"/>
+              <w:spacing w:before="40" w:after="60" w:line="250" w:lineRule="auto"/>
             </w:pPr>
             <w:r>
               <w:rPr>
                 <w:sz w:val="18"/>
               </w:rPr>
-              <w:t>电缆被建筑隔热材料包围时，热量较难散出。影响取决于包围程度、长度及散热接触条件。应采用适用的Ci，并确认参考方法已包含哪些热条件，避免重复折减。</w:t>
+              <w:t>表中spaced表示相邻电缆表面净距至少为一个电缆外径De。在表注所适用的水平排列中，水平净距大于2De可不作成组修正；该条件不能任意推广至其他围护或地沟情况。</w:t>
             </w:r>
           </w:p>
         </w:tc>
         <w:tc>
           <w:tcPr>
-            <w:tcW w:type="dxa" w:w="4847"/>
+            <w:tcW w:type="dxa" w:w="4876"/>
           </w:tcPr>
           <w:p>
             <w:pPr>
-              <w:spacing w:before="30" w:after="50" w:line="247" w:lineRule="auto"/>
+              <w:spacing w:before="40" w:after="60" w:line="250" w:lineRule="auto"/>
             </w:pPr>
             <w:r>
               <w:rPr>
                 <w:sz w:val="18"/>
               </w:rPr>
-              <w:t>Building thermal insulation restricts heat loss from a cable. The effect depends on the extent and length of enclosure and the available heat-transfer path. Apply the appropriate Ci, checking which thermal effects are already included in the reference method to avoid double counting.</w:t>
-            </w:r>
-          </w:p>
-        </w:tc>
-      </w:tr>
-      <w:tr>
-        <w:trPr>
-          <w:cantSplit/>
-        </w:trPr>
-        <w:tc>
-          <w:tcPr>
-            <w:tcW w:type="dxa" w:w="2523"/>
-          </w:tcPr>
-          <w:p>
-            <w:pPr>
-              <w:spacing w:before="30" w:after="50" w:line="247" w:lineRule="auto"/>
-            </w:pPr>
-            <w:r>
-              <w:rPr>
-                <w:sz w:val="18"/>
-              </w:rPr>
-              <w:t>11 Protective-device rating (In) and Cd</w:t>
-              <w:br/>
-              <w:t>保护器件额定值及修正</w:t>
-            </w:r>
-          </w:p>
-        </w:tc>
-        <w:tc>
-          <w:tcPr>
-            <w:tcW w:type="dxa" w:w="3005"/>
-          </w:tcPr>
-          <w:p>
-            <w:pPr>
-              <w:spacing w:before="30" w:after="50" w:line="247" w:lineRule="auto"/>
-            </w:pPr>
-            <w:r>
-              <w:rPr>
-                <w:sz w:val="18"/>
-              </w:rPr>
-              <w:t>电缆应与过载保护额定值或整定值协调。Cd在采用BS 3036半封闭熔断器的课程选线方法中为0.725，其他所列类型通常为1。电动机回路须适当配合启动与过载保护。</w:t>
-            </w:r>
-          </w:p>
-        </w:tc>
-        <w:tc>
-          <w:tcPr>
-            <w:tcW w:type="dxa" w:w="4847"/>
-          </w:tcPr>
-          <w:p>
-            <w:pPr>
-              <w:spacing w:before="30" w:after="50" w:line="247" w:lineRule="auto"/>
-            </w:pPr>
-            <w:r>
-              <w:rPr>
-                <w:sz w:val="18"/>
-              </w:rPr>
-              <w:t>Coordinate the cable with the overload protective-device rating or setting. In the course sizing method, Cd is 0.725 for a BS 3036 semi-enclosed fuse and normally 1 for the other listed types. Motor starting and overload protection must be coordinated appropriately.</w:t>
+              <w:t>In the table, spaced means a surface clearance of at least one cable diameter De. For the horizontal arrangements covered by its note, clearance exceeding 2De removes the grouping correction. Apply that concession only within the stated arrangement.</w:t>
             </w:r>
           </w:p>
         </w:tc>
@@ -1047,165 +794,27 @@
         <w:pStyle w:val="Heading2"/>
       </w:pPr>
       <w:r>
-        <w:t>修正系数与保护配合 / Corrections and protection coordination</w:t>
-      </w:r>
-    </w:p>
-    <w:p>
-      <w:pPr>
-        <w:spacing w:before="80" w:after="120"/>
-        <w:jc w:val="center"/>
-      </w:pPr>
-      <w:r>
-        <w:rPr>
-          <w:b/>
-          <w:sz w:val="26"/>
-        </w:rPr>
-        <w:t>I</w:t>
-      </w:r>
-      <w:r>
-        <w:rPr>
-          <w:b/>
-          <w:sz w:val="26"/>
-          <w:vertAlign w:val="subscript"/>
-        </w:rPr>
-        <w:t>b</w:t>
-      </w:r>
-      <w:r>
-        <w:rPr>
-          <w:b/>
-          <w:sz w:val="26"/>
-        </w:rPr>
-        <w:t xml:space="preserve"> ≤ I</w:t>
-      </w:r>
-      <w:r>
-        <w:rPr>
-          <w:b/>
-          <w:sz w:val="26"/>
-          <w:vertAlign w:val="subscript"/>
-        </w:rPr>
-        <w:t>n</w:t>
-      </w:r>
-      <w:r>
-        <w:rPr>
-          <w:b/>
-          <w:sz w:val="26"/>
-        </w:rPr>
-        <w:t xml:space="preserve"> ≤ I</w:t>
-      </w:r>
-      <w:r>
-        <w:rPr>
-          <w:b/>
-          <w:sz w:val="26"/>
-          <w:vertAlign w:val="subscript"/>
-        </w:rPr>
-        <w:t>z</w:t>
-      </w:r>
-      <w:r>
-        <w:rPr>
-          <w:b/>
-          <w:sz w:val="26"/>
-        </w:rPr>
-        <w:t xml:space="preserve">       I</w:t>
-      </w:r>
-      <w:r>
-        <w:rPr>
-          <w:b/>
-          <w:sz w:val="26"/>
-          <w:vertAlign w:val="subscript"/>
-        </w:rPr>
-        <w:t>t</w:t>
-      </w:r>
-      <w:r>
-        <w:rPr>
-          <w:b/>
-          <w:sz w:val="26"/>
-        </w:rPr>
-        <w:t xml:space="preserve"> ≥ I</w:t>
-      </w:r>
-      <w:r>
-        <w:rPr>
-          <w:b/>
-          <w:sz w:val="26"/>
-          <w:vertAlign w:val="subscript"/>
-        </w:rPr>
-        <w:t>n</w:t>
-      </w:r>
-      <w:r>
-        <w:rPr>
-          <w:b/>
-          <w:sz w:val="26"/>
-        </w:rPr>
-        <w:t xml:space="preserve"> ÷ (C</w:t>
-      </w:r>
-      <w:r>
-        <w:rPr>
-          <w:b/>
-          <w:sz w:val="26"/>
-          <w:vertAlign w:val="subscript"/>
-        </w:rPr>
-        <w:t>a</w:t>
-      </w:r>
-      <w:r>
-        <w:rPr>
-          <w:b/>
-          <w:sz w:val="26"/>
-        </w:rPr>
-        <w:t xml:space="preserve"> × C</w:t>
-      </w:r>
-      <w:r>
-        <w:rPr>
-          <w:b/>
-          <w:sz w:val="26"/>
-          <w:vertAlign w:val="subscript"/>
-        </w:rPr>
-        <w:t>g</w:t>
-      </w:r>
-      <w:r>
-        <w:rPr>
-          <w:b/>
-          <w:sz w:val="26"/>
-        </w:rPr>
-        <w:t xml:space="preserve"> × C</w:t>
-      </w:r>
-      <w:r>
-        <w:rPr>
-          <w:b/>
-          <w:sz w:val="26"/>
-          <w:vertAlign w:val="subscript"/>
-        </w:rPr>
-        <w:t>i</w:t>
-      </w:r>
-      <w:r>
-        <w:rPr>
-          <w:b/>
-          <w:sz w:val="26"/>
-        </w:rPr>
-        <w:t xml:space="preserve"> × C</w:t>
-      </w:r>
-      <w:r>
-        <w:rPr>
-          <w:b/>
-          <w:sz w:val="26"/>
-          <w:vertAlign w:val="subscript"/>
-        </w:rPr>
-        <w:t>d</w:t>
-      </w:r>
-      <w:r>
-        <w:rPr>
-          <w:b/>
-          <w:sz w:val="26"/>
-        </w:rPr>
-        <w:t>)</w:t>
+        <w:t>成组表注的影响 / Conditions attached to grouping factors</w:t>
       </w:r>
     </w:p>
     <w:p>
       <w:r>
-        <w:t>Ib为设计电流；In为过载保护额定值或整定值；Iz为安装后的载流量；It为表列载流量。仅采用实际适用的修正。</w:t>
+        <w:t>A5(3)的基本系数适用于同一截面的成组电缆。不同允许运行温度的电缆同组时，按组内最低允许温度确定额定值。仅在已知运行条件下，某电缆预计电流不超过其成组额定值30%时，才可在计算其余电缆的成组系数时忽略该电缆；其自身仍须满足选线及保护要求。</w:t>
       </w:r>
     </w:p>
     <w:p>
       <w:r>
-        <w:t>Ib: design current; In: overload-protection rating or setting; Iz: installed capacity; It: tabulated capacity. Apply only the relevant correction factors.</w:t>
+        <w:t>The basic A5(3) factors apply to groups of one conductor size. Where cables have different permissible operating temperatures, base the group rating on the lowest. A cable expected, under known operating conditions, to carry no more than 30% of its grouped rating may be ignored when determining the factor for the remaining cables. It still needs appropriate sizing and protection.</w:t>
+      </w:r>
+    </w:p>
+    <w:p>
+      <w:r>
+        <w:t>例如普通70°C PVC在45°C环境下，A5(1)给出0.79，而A5(2)给出0.91。应先确定保护器件的用途，再选温度表，随后按适用条件考虑A5(5)。</w:t>
+      </w:r>
+    </w:p>
+    <w:p>
+      <w:r>
+        <w:t>For example, at 45°C, ordinary 70°C PVC has a factor of 0.79 in A5(1) and 0.91 in A5(2). Establish the protective-device duty before selecting the temperature table, then consider A5(5) where applicable.</w:t>
       </w:r>
     </w:p>
     <w:p>
@@ -1218,7 +827,7 @@
         <w:pStyle w:val="Heading1"/>
       </w:pPr>
       <w:r>
-        <w:t>4 电气性能及保护 / Electrical performance and protection</w:t>
+        <w:t>4 隔热、保护器件及地沟修正 / Insulation, protection and trenches</w:t>
       </w:r>
     </w:p>
     <w:tbl>
@@ -1229,9 +838,9 @@
         <w:tblLook w:firstColumn="1" w:firstRow="1" w:lastColumn="0" w:lastRow="0" w:noHBand="0" w:noVBand="1" w:val="04A0"/>
       </w:tblPr>
       <w:tblGrid>
-        <w:gridCol w:w="2523"/>
-        <w:gridCol w:w="3005"/>
-        <w:gridCol w:w="4847"/>
+        <w:gridCol w:w="2353"/>
+        <w:gridCol w:w="3203"/>
+        <w:gridCol w:w="4876"/>
       </w:tblGrid>
       <w:tr>
         <w:trPr>
@@ -1239,7 +848,7 @@
         </w:trPr>
         <w:tc>
           <w:tcPr>
-            <w:tcW w:type="dxa" w:w="2523"/>
+            <w:tcW w:type="dxa" w:w="2353"/>
             <w:shd w:fill="E7EDF2"/>
           </w:tcPr>
           <w:p>
@@ -1253,7 +862,7 @@
         </w:tc>
         <w:tc>
           <w:tcPr>
-            <w:tcW w:type="dxa" w:w="3005"/>
+            <w:tcW w:type="dxa" w:w="3203"/>
             <w:shd w:fill="E7EDF2"/>
           </w:tcPr>
           <w:p>
@@ -1267,7 +876,7 @@
         </w:tc>
         <w:tc>
           <w:tcPr>
-            <w:tcW w:type="dxa" w:w="4847"/>
+            <w:tcW w:type="dxa" w:w="4876"/>
             <w:shd w:fill="E7EDF2"/>
           </w:tcPr>
           <w:p>
@@ -1286,51 +895,51 @@
         </w:trPr>
         <w:tc>
           <w:tcPr>
-            <w:tcW w:type="dxa" w:w="2523"/>
+            <w:tcW w:type="dxa" w:w="2353"/>
           </w:tcPr>
           <w:p>
             <w:pPr>
-              <w:spacing w:before="60" w:after="80" w:line="259" w:lineRule="auto"/>
+              <w:spacing w:before="40" w:after="60" w:line="250" w:lineRule="auto"/>
             </w:pPr>
             <w:r>
               <w:rPr>
-                <w:sz w:val="19"/>
+                <w:sz w:val="18"/>
               </w:rPr>
-              <w:t>12 Cable length and voltage drop</w:t>
+              <w:t>Table A5(4)</w:t>
               <w:br/>
-              <w:t>电缆长度及电压降</w:t>
+              <w:t>隔热材料包围</w:t>
             </w:r>
           </w:p>
         </w:tc>
         <w:tc>
           <w:tcPr>
-            <w:tcW w:type="dxa" w:w="3005"/>
+            <w:tcW w:type="dxa" w:w="3203"/>
           </w:tcPr>
           <w:p>
             <w:pPr>
-              <w:spacing w:before="60" w:after="80" w:line="259" w:lineRule="auto"/>
+              <w:spacing w:before="40" w:after="60" w:line="250" w:lineRule="auto"/>
             </w:pPr>
             <w:r>
               <w:rPr>
-                <w:sz w:val="19"/>
+                <w:sz w:val="18"/>
               </w:rPr>
-              <w:t>线路越长、负载电流越大，压降通常越大；导体电阻、电抗及功率因数亦有影响。长距离回路即使载流量合格，也可能须增大截面，以保证设备端电压及电动机启动性能。</w:t>
+              <w:t>建筑隔热材料阻碍散热。若电缆在隔热墙或天花内且一侧接触导热表面，应按Method 4及其条件选额定值。完全包围时，包围长度及材料导热性能决定进一步折减，不能仅因导体截面不变便沿用开放敷设额定值。</w:t>
             </w:r>
           </w:p>
         </w:tc>
         <w:tc>
           <w:tcPr>
-            <w:tcW w:type="dxa" w:w="4847"/>
+            <w:tcW w:type="dxa" w:w="4876"/>
           </w:tcPr>
           <w:p>
             <w:pPr>
-              <w:spacing w:before="60" w:after="80" w:line="259" w:lineRule="auto"/>
+              <w:spacing w:before="40" w:after="60" w:line="250" w:lineRule="auto"/>
             </w:pPr>
             <w:r>
               <w:rPr>
-                <w:sz w:val="19"/>
+                <w:sz w:val="18"/>
               </w:rPr>
-              <w:t>Longer routes and higher load current generally increase voltage drop; conductor resistance, reactance and power factor also matter. A long circuit may require a larger conductor even when its thermal rating is adequate, to maintain terminal voltage and motor-starting performance.</w:t>
+              <w:t>Thermal insulation restricts heat loss. For the stated insulated-wall or ceiling arrangement with one side in contact with a conducting surface, use Method 4 and its conditions. Total enclosure requires assessment of the enclosed length and insulation properties, rather than retaining an open-installation rating.</w:t>
             </w:r>
           </w:p>
         </w:tc>
@@ -1341,51 +950,51 @@
         </w:trPr>
         <w:tc>
           <w:tcPr>
-            <w:tcW w:type="dxa" w:w="2523"/>
+            <w:tcW w:type="dxa" w:w="2353"/>
           </w:tcPr>
           <w:p>
             <w:pPr>
-              <w:spacing w:before="60" w:after="80" w:line="259" w:lineRule="auto"/>
+              <w:spacing w:before="40" w:after="60" w:line="250" w:lineRule="auto"/>
             </w:pPr>
             <w:r>
               <w:rPr>
-                <w:sz w:val="19"/>
+                <w:sz w:val="18"/>
               </w:rPr>
-              <w:t>13 Short-circuit withstand</w:t>
+              <w:t>Table A5(5)</w:t>
               <w:br/>
-              <w:t>短路承受能力</w:t>
+              <w:t>保护器件类型修正</w:t>
             </w:r>
           </w:p>
         </w:tc>
         <w:tc>
           <w:tcPr>
-            <w:tcW w:type="dxa" w:w="3005"/>
+            <w:tcW w:type="dxa" w:w="3203"/>
           </w:tcPr>
           <w:p>
             <w:pPr>
-              <w:spacing w:before="60" w:after="80" w:line="259" w:lineRule="auto"/>
+              <w:spacing w:before="40" w:after="60" w:line="250" w:lineRule="auto"/>
             </w:pPr>
             <w:r>
               <w:rPr>
-                <w:sz w:val="19"/>
+                <w:sz w:val="18"/>
               </w:rPr>
-              <w:t>导体和绝缘必须承受故障电流在切除前产生的热应力。预期故障电流越大、切除时间越长，要求越严格；保护器件的分断能力亦须足以切断该故障电流。</w:t>
+              <w:t>过载保护额定值或整定值In必须与安装后的载流量协调。A5(5)对BS 3036半封闭熔断器给出0.725，其他所列器件为1.0。器件类型会影响所需表列载流量，不能仅比较负载电流与未修正的额定值。</w:t>
             </w:r>
           </w:p>
         </w:tc>
         <w:tc>
           <w:tcPr>
-            <w:tcW w:type="dxa" w:w="4847"/>
+            <w:tcW w:type="dxa" w:w="4876"/>
           </w:tcPr>
           <w:p>
             <w:pPr>
-              <w:spacing w:before="60" w:after="80" w:line="259" w:lineRule="auto"/>
+              <w:spacing w:before="40" w:after="60" w:line="250" w:lineRule="auto"/>
             </w:pPr>
             <w:r>
               <w:rPr>
-                <w:sz w:val="19"/>
+                <w:sz w:val="18"/>
               </w:rPr>
-              <w:t>The conductor and insulation must withstand the thermal stress produced before a fault is cleared. Higher prospective fault current and longer clearing time increase the duty. The protective device must also have sufficient breaking capacity to interrupt that fault current.</w:t>
+              <w:t>Coordinate the overload-protection rating or setting In with installed cable capacity. A5(5) gives 0.725 for a BS 3036 semi-enclosed fuse and 1.0 for the other listed devices. The device type therefore affects the required tabulated capacity.</w:t>
             </w:r>
           </w:p>
         </w:tc>
@@ -1396,106 +1005,51 @@
         </w:trPr>
         <w:tc>
           <w:tcPr>
-            <w:tcW w:type="dxa" w:w="2523"/>
+            <w:tcW w:type="dxa" w:w="2353"/>
           </w:tcPr>
           <w:p>
             <w:pPr>
-              <w:spacing w:before="60" w:after="80" w:line="259" w:lineRule="auto"/>
+              <w:spacing w:before="40" w:after="60" w:line="250" w:lineRule="auto"/>
             </w:pPr>
             <w:r>
               <w:rPr>
-                <w:sz w:val="19"/>
+                <w:sz w:val="18"/>
               </w:rPr>
-              <w:t>14 Earth-fault protection and protective conductor</w:t>
+              <w:t>Table A5(6)</w:t>
               <w:br/>
-              <w:t>接地故障保护及保护导体</w:t>
+              <w:t>封闭地沟修正</w:t>
             </w:r>
           </w:p>
         </w:tc>
         <w:tc>
           <w:tcPr>
-            <w:tcW w:type="dxa" w:w="3005"/>
+            <w:tcW w:type="dxa" w:w="3203"/>
           </w:tcPr>
           <w:p>
             <w:pPr>
-              <w:spacing w:before="60" w:after="80" w:line="259" w:lineRule="auto"/>
+              <w:spacing w:before="40" w:after="60" w:line="250" w:lineRule="auto"/>
             </w:pPr>
             <w:r>
               <w:rPr>
-                <w:sz w:val="19"/>
+                <w:sz w:val="18"/>
               </w:rPr>
-              <w:t>应核查故障环路阻抗、保护导体连续性及所需切除条件。线路过长或导体过小会增加环路阻抗；相导体和保护导体的截面须与故障保护配合。</w:t>
+              <w:t>封闭地沟内热量积聚。Method 18、19、20须匹配沟体、盖板、排列、间距、数量和截面，并将A5(6)用于相应Method 12或13的基础载流量。截面改变后须重新核对系数；不同温度电缆混组仍按最低允许运行温度。</w:t>
             </w:r>
           </w:p>
         </w:tc>
         <w:tc>
           <w:tcPr>
-            <w:tcW w:type="dxa" w:w="4847"/>
+            <w:tcW w:type="dxa" w:w="4876"/>
           </w:tcPr>
           <w:p>
             <w:pPr>
-              <w:spacing w:before="60" w:after="80" w:line="259" w:lineRule="auto"/>
+              <w:spacing w:before="40" w:after="60" w:line="250" w:lineRule="auto"/>
             </w:pPr>
             <w:r>
               <w:rPr>
-                <w:sz w:val="19"/>
+                <w:sz w:val="18"/>
               </w:rPr>
-              <w:t>Check earth-fault loop impedance, protective-conductor continuity and the required disconnection conditions. Long routes or small conductors increase loop impedance. Phase and protective-conductor sizes must be coordinated with the fault-protection arrangement.</w:t>
-            </w:r>
-          </w:p>
-        </w:tc>
-      </w:tr>
-      <w:tr>
-        <w:trPr>
-          <w:cantSplit/>
-        </w:trPr>
-        <w:tc>
-          <w:tcPr>
-            <w:tcW w:type="dxa" w:w="2523"/>
-          </w:tcPr>
-          <w:p>
-            <w:pPr>
-              <w:spacing w:before="60" w:after="80" w:line="259" w:lineRule="auto"/>
-            </w:pPr>
-            <w:r>
-              <w:rPr>
-                <w:sz w:val="19"/>
-              </w:rPr>
-              <w:t>15 Power loss and energy efficiency</w:t>
-              <w:br/>
-              <w:t>功率损耗及能源效益</w:t>
-            </w:r>
-          </w:p>
-        </w:tc>
-        <w:tc>
-          <w:tcPr>
-            <w:tcW w:type="dxa" w:w="3005"/>
-          </w:tcPr>
-          <w:p>
-            <w:pPr>
-              <w:spacing w:before="60" w:after="80" w:line="259" w:lineRule="auto"/>
-            </w:pPr>
-            <w:r>
-              <w:rPr>
-                <w:sz w:val="19"/>
-              </w:rPr>
-              <w:t>工业设备可能长时间带载运行，导体电阻引起的I²R损耗会形成持续电费及发热。较大截面通常可降低电阻和损耗，应综合初期成本、使用时间及运行成本选择。</w:t>
-            </w:r>
-          </w:p>
-        </w:tc>
-        <w:tc>
-          <w:tcPr>
-            <w:tcW w:type="dxa" w:w="4847"/>
-          </w:tcPr>
-          <w:p>
-            <w:pPr>
-              <w:spacing w:before="60" w:after="80" w:line="259" w:lineRule="auto"/>
-            </w:pPr>
-            <w:r>
-              <w:rPr>
-                <w:sz w:val="19"/>
-              </w:rPr>
-              <w:t>Industrial equipment may operate under load for long periods. Conductor I²R loss causes continuing energy cost and heating. A larger cross-sectional area generally reduces resistance and losses, so initial cost should be assessed together with operating hours and energy cost.</w:t>
+              <w:t>Enclosed trenches retain heat. For Methods 18–20, match trench geometry, cover, cable layout, spacing, count and cross-section. Apply A5(6) to the corresponding Method 12 or 13 base capacity. Recheck the factor after a size change; mixed-temperature groups remain governed by the lowest permissible temperature.</w:t>
             </w:r>
           </w:p>
         </w:tc>
@@ -1506,27 +1060,183 @@
         <w:pStyle w:val="Heading2"/>
       </w:pPr>
       <w:r>
-        <w:t>压降应合并检查 / Check the complete voltage-drop budget</w:t>
+        <w:t>隔热修正的适用范围 / Limits of the insulation factors</w:t>
       </w:r>
     </w:p>
     <w:p>
       <w:r>
-        <w:t>应把上游与下游压降合并检查。在本课程采用的4%总压降条件下，如果上游已使用1%，下游可用余量便为3%。表列mV/A/m值须与相制、导体排列及安装条件匹配。电动机回路还须检查启动期间的电压下降。</w:t>
+        <w:t>完全被隔热材料包围超过0.5m时，在没有更精确资料下，按开放直接固定Method 1载流量的0.5倍取值。短于0.5m时，A5(4)列出50、100、200及400mm对应0.88、0.78、0.63及0.51；该表限用于不大于10mm²的导体，且隔热材料导热系数大于0.04W/(m·K)。</w:t>
       </w:r>
     </w:p>
     <w:p>
       <w:r>
-        <w:t>Assess upstream and downstream voltage drop together. Under the 4% total limit used in the course, an upstream drop of 1% leaves 3% for the downstream circuit. Select the mV/A/m data for the correct phase arrangement, conductor disposition and installation. Motor circuits also require a starting-voltage check.</w:t>
+        <w:t>For total enclosure exceeding 0.5m, use 0.5 times the Method 1 clipped-direct capacity in the absence of more precise information. For shorter lengths, A5(4) gives 0.88, 0.78, 0.63 and 0.51 at 50, 100, 200 and 400mm. Its stated scope is conductors up to 10mm² and insulation thermal conductivity greater than 0.04W/(m·K).</w:t>
+      </w:r>
+    </w:p>
+    <w:p>
+      <w:pPr>
+        <w:pStyle w:val="Heading2"/>
+      </w:pPr>
+      <w:r>
+        <w:t>载流量及保护配合 / Capacity and protection coordination</w:t>
+      </w:r>
+    </w:p>
+    <w:p>
+      <w:pPr>
+        <w:spacing w:before="80" w:after="100"/>
+        <w:jc w:val="center"/>
+      </w:pPr>
+      <w:r>
+        <w:rPr>
+          <w:b/>
+          <w:sz w:val="24"/>
+        </w:rPr>
+        <w:t>I</w:t>
+      </w:r>
+      <w:r>
+        <w:rPr>
+          <w:b/>
+          <w:sz w:val="24"/>
+          <w:vertAlign w:val="subscript"/>
+        </w:rPr>
+        <w:t>b</w:t>
+      </w:r>
+      <w:r>
+        <w:rPr>
+          <w:b/>
+          <w:sz w:val="24"/>
+        </w:rPr>
+        <w:t xml:space="preserve"> ≤ I</w:t>
+      </w:r>
+      <w:r>
+        <w:rPr>
+          <w:b/>
+          <w:sz w:val="24"/>
+          <w:vertAlign w:val="subscript"/>
+        </w:rPr>
+        <w:t>n</w:t>
+      </w:r>
+      <w:r>
+        <w:rPr>
+          <w:b/>
+          <w:sz w:val="24"/>
+        </w:rPr>
+        <w:t xml:space="preserve"> ≤ I</w:t>
+      </w:r>
+      <w:r>
+        <w:rPr>
+          <w:b/>
+          <w:sz w:val="24"/>
+          <w:vertAlign w:val="subscript"/>
+        </w:rPr>
+        <w:t>z</w:t>
+      </w:r>
+      <w:r>
+        <w:rPr>
+          <w:b/>
+          <w:sz w:val="24"/>
+        </w:rPr>
+        <w:t xml:space="preserve">      I</w:t>
+      </w:r>
+      <w:r>
+        <w:rPr>
+          <w:b/>
+          <w:sz w:val="24"/>
+          <w:vertAlign w:val="subscript"/>
+        </w:rPr>
+        <w:t>t</w:t>
+      </w:r>
+      <w:r>
+        <w:rPr>
+          <w:b/>
+          <w:sz w:val="24"/>
+        </w:rPr>
+        <w:t xml:space="preserve"> ≥ I</w:t>
+      </w:r>
+      <w:r>
+        <w:rPr>
+          <w:b/>
+          <w:sz w:val="24"/>
+          <w:vertAlign w:val="subscript"/>
+        </w:rPr>
+        <w:t>n</w:t>
+      </w:r>
+      <w:r>
+        <w:rPr>
+          <w:b/>
+          <w:sz w:val="24"/>
+        </w:rPr>
+        <w:t xml:space="preserve"> ÷ (C</w:t>
+      </w:r>
+      <w:r>
+        <w:rPr>
+          <w:b/>
+          <w:sz w:val="24"/>
+          <w:vertAlign w:val="subscript"/>
+        </w:rPr>
+        <w:t>a</w:t>
+      </w:r>
+      <w:r>
+        <w:rPr>
+          <w:b/>
+          <w:sz w:val="24"/>
+        </w:rPr>
+        <w:t xml:space="preserve"> × C</w:t>
+      </w:r>
+      <w:r>
+        <w:rPr>
+          <w:b/>
+          <w:sz w:val="24"/>
+          <w:vertAlign w:val="subscript"/>
+        </w:rPr>
+        <w:t>g</w:t>
+      </w:r>
+      <w:r>
+        <w:rPr>
+          <w:b/>
+          <w:sz w:val="24"/>
+        </w:rPr>
+        <w:t xml:space="preserve"> × C</w:t>
+      </w:r>
+      <w:r>
+        <w:rPr>
+          <w:b/>
+          <w:sz w:val="24"/>
+          <w:vertAlign w:val="subscript"/>
+        </w:rPr>
+        <w:t>i</w:t>
+      </w:r>
+      <w:r>
+        <w:rPr>
+          <w:b/>
+          <w:sz w:val="24"/>
+        </w:rPr>
+        <w:t xml:space="preserve"> × C</w:t>
+      </w:r>
+      <w:r>
+        <w:rPr>
+          <w:b/>
+          <w:sz w:val="24"/>
+          <w:vertAlign w:val="subscript"/>
+        </w:rPr>
+        <w:t>d</w:t>
+      </w:r>
+      <w:r>
+        <w:rPr>
+          <w:b/>
+          <w:sz w:val="24"/>
+        </w:rPr>
+        <w:t>)</w:t>
       </w:r>
     </w:p>
     <w:p>
       <w:r>
-        <w:t>因此，截面应满足所有适用条件：载流量合格后，若压降、故障承受能力或保护配合仍不满足，便须增大截面、改善路线或调整设计。</w:t>
+        <w:t>Ib为设计电流，In为过载保护额定值或整定值，Iz为实际安装载流量，It为表列载流量。第二式说明一般温度、成组、隔热和器件修正的选线关系。特殊地沟按A5(6)及相关表注处理；各修正只在适用时采用，并避免重复计入同一热效应。</w:t>
       </w:r>
     </w:p>
     <w:p>
       <w:r>
-        <w:t>The size must therefore satisfy every applicable condition. After meeting the thermal rating, an unsatisfactory voltage drop, fault withstand or protection arrangement still requires a larger conductor, an improved route or another design adjustment.</w:t>
+        <w:t>Ib is design current, In the overload-protection rating or setting, Iz installed capacity and It tabulated capacity. The second relation illustrates the usual temperature, grouping, insulation and device corrections. Treat special trenches using A5(6) and its notes. Apply only relevant corrections and avoid counting the same thermal effect twice.</w:t>
       </w:r>
     </w:p>
     <w:p>
@@ -1539,7 +1249,17 @@
         <w:pStyle w:val="Heading1"/>
       </w:pPr>
       <w:r>
-        <w:t>5 工业环境适用性 / Suitability for industrial conditions</w:t>
+        <w:t>5 安装方式及参考方法 / Installation and reference methods</w:t>
+      </w:r>
+    </w:p>
+    <w:p>
+      <w:r>
+        <w:t>Appendix 7区分实际安装方式与查额定值所用的参考方法。工业厂房中常见的管槽、桥架、建筑孔洞及地沟，应按下列条件对应，再结合Table A6(1)和适用修正系数。</w:t>
+      </w:r>
+    </w:p>
+    <w:p>
+      <w:r>
+        <w:t>Appendix 7 distinguishes the actual installation from the reference method used for rating. Match factory conduits, trunking, trays, building voids and trenches to the stated conditions before selecting the Table A6(1) column and applicable corrections.</w:t>
       </w:r>
     </w:p>
     <w:tbl>
@@ -1550,9 +1270,9 @@
         <w:tblLook w:firstColumn="1" w:firstRow="1" w:lastColumn="0" w:lastRow="0" w:noHBand="0" w:noVBand="1" w:val="04A0"/>
       </w:tblPr>
       <w:tblGrid>
-        <w:gridCol w:w="2523"/>
-        <w:gridCol w:w="3005"/>
-        <w:gridCol w:w="4847"/>
+        <w:gridCol w:w="2353"/>
+        <w:gridCol w:w="3203"/>
+        <w:gridCol w:w="4876"/>
       </w:tblGrid>
       <w:tr>
         <w:trPr>
@@ -1560,7 +1280,7 @@
         </w:trPr>
         <w:tc>
           <w:tcPr>
-            <w:tcW w:type="dxa" w:w="2523"/>
+            <w:tcW w:type="dxa" w:w="2353"/>
             <w:shd w:fill="E7EDF2"/>
           </w:tcPr>
           <w:p>
@@ -1574,7 +1294,7 @@
         </w:tc>
         <w:tc>
           <w:tcPr>
-            <w:tcW w:type="dxa" w:w="3005"/>
+            <w:tcW w:type="dxa" w:w="3203"/>
             <w:shd w:fill="E7EDF2"/>
           </w:tcPr>
           <w:p>
@@ -1588,7 +1308,7 @@
         </w:tc>
         <w:tc>
           <w:tcPr>
-            <w:tcW w:type="dxa" w:w="4847"/>
+            <w:tcW w:type="dxa" w:w="4876"/>
             <w:shd w:fill="E7EDF2"/>
           </w:tcPr>
           <w:p>
@@ -1607,51 +1327,51 @@
         </w:trPr>
         <w:tc>
           <w:tcPr>
-            <w:tcW w:type="dxa" w:w="2523"/>
+            <w:tcW w:type="dxa" w:w="2353"/>
           </w:tcPr>
           <w:p>
             <w:pPr>
-              <w:spacing w:before="60" w:after="80" w:line="259" w:lineRule="auto"/>
+              <w:spacing w:before="40" w:after="60" w:line="250" w:lineRule="auto"/>
             </w:pPr>
             <w:r>
               <w:rPr>
-                <w:sz w:val="19"/>
+                <w:sz w:val="18"/>
               </w:rPr>
-              <w:t>16 External influences</w:t>
+              <w:t>Method 1</w:t>
               <w:br/>
-              <w:t>外部环境影响</w:t>
+              <w:t>开放直接固定</w:t>
             </w:r>
           </w:p>
         </w:tc>
         <w:tc>
           <w:tcPr>
-            <w:tcW w:type="dxa" w:w="3005"/>
+            <w:tcW w:type="dxa" w:w="3203"/>
           </w:tcPr>
           <w:p>
             <w:pPr>
-              <w:spacing w:before="60" w:after="80" w:line="259" w:lineRule="auto"/>
+              <w:spacing w:before="40" w:after="60" w:line="250" w:lineRule="auto"/>
             </w:pPr>
             <w:r>
               <w:rPr>
-                <w:sz w:val="19"/>
+                <w:sz w:val="18"/>
               </w:rPr>
-              <w:t>潮湿、水、油、化学品、腐蚀性气体、粉尘及外部热源会影响绝缘和护套寿命。应选择相容材料、密封及防护方式；增加截面并不能代替所需的环境适用性。</w:t>
+              <w:t>带护套电缆直接固定于非金属表面，按Method 1查额定值。散热较开放，但仍须评估温度及成组。</w:t>
             </w:r>
           </w:p>
         </w:tc>
         <w:tc>
           <w:tcPr>
-            <w:tcW w:type="dxa" w:w="4847"/>
+            <w:tcW w:type="dxa" w:w="4876"/>
           </w:tcPr>
           <w:p>
             <w:pPr>
-              <w:spacing w:before="60" w:after="80" w:line="259" w:lineRule="auto"/>
+              <w:spacing w:before="40" w:after="60" w:line="250" w:lineRule="auto"/>
             </w:pPr>
             <w:r>
               <w:rPr>
-                <w:sz w:val="19"/>
+                <w:sz w:val="18"/>
               </w:rPr>
-              <w:t>Moisture, water, oils, chemicals, corrosive atmospheres, dust and external heat can damage insulation or sheath. Select compatible materials, sealing and protection. A larger conductor cross-section does not replace the need for environmental suitability.</w:t>
+              <w:t>Sheathed cables clipped directly to a non-metallic surface use Method 1. Cooling is relatively open, but temperature and grouping still require assessment.</w:t>
             </w:r>
           </w:p>
         </w:tc>
@@ -1662,51 +1382,51 @@
         </w:trPr>
         <w:tc>
           <w:tcPr>
-            <w:tcW w:type="dxa" w:w="2523"/>
+            <w:tcW w:type="dxa" w:w="2353"/>
           </w:tcPr>
           <w:p>
             <w:pPr>
-              <w:spacing w:before="60" w:after="80" w:line="259" w:lineRule="auto"/>
+              <w:spacing w:before="40" w:after="60" w:line="250" w:lineRule="auto"/>
             </w:pPr>
             <w:r>
               <w:rPr>
-                <w:sz w:val="19"/>
+                <w:sz w:val="18"/>
               </w:rPr>
-              <w:t>17 Mechanical stresses</w:t>
+              <w:t>Methods 3, 5, 7–10</w:t>
               <w:br/>
-              <w:t>机械应力</w:t>
+              <w:t>一般管槽内</w:t>
             </w:r>
           </w:p>
         </w:tc>
         <w:tc>
           <w:tcPr>
-            <w:tcW w:type="dxa" w:w="3005"/>
+            <w:tcW w:type="dxa" w:w="3203"/>
           </w:tcPr>
           <w:p>
             <w:pPr>
-              <w:spacing w:before="60" w:after="80" w:line="259" w:lineRule="auto"/>
+              <w:spacing w:before="40" w:after="60" w:line="250" w:lineRule="auto"/>
             </w:pPr>
             <w:r>
               <w:rPr>
-                <w:sz w:val="19"/>
+                <w:sz w:val="18"/>
               </w:rPr>
-              <w:t>冲击、磨损、振动、拉力及反复移动会影响电缆结构与支承要求。固定厂房线路可采用合适铠装或管槽保护；移动机械须采用适合反复弯曲的电缆及连接方式。</w:t>
+              <w:t>墙面或天花管道、非隔热砌体内管道，以及壁面、地板或踢脚线线槽，按所示条件采用参考Method 3。围护限制散热。</w:t>
             </w:r>
           </w:p>
         </w:tc>
         <w:tc>
           <w:tcPr>
-            <w:tcW w:type="dxa" w:w="4847"/>
+            <w:tcW w:type="dxa" w:w="4876"/>
           </w:tcPr>
           <w:p>
             <w:pPr>
-              <w:spacing w:before="60" w:after="80" w:line="259" w:lineRule="auto"/>
+              <w:spacing w:before="40" w:after="60" w:line="250" w:lineRule="auto"/>
             </w:pPr>
             <w:r>
               <w:rPr>
-                <w:sz w:val="19"/>
+                <w:sz w:val="18"/>
               </w:rPr>
-              <w:t>Impact, abrasion, vibration, tension and repeated movement govern cable construction and support. Fixed factory circuits may need appropriate armour or containment. Moving machinery requires cables and connections suitable for repeated flexing.</w:t>
+              <w:t>The shown conduit, non-insulating masonry and wall, floor or skirting-trunking arrangements use reference Method 3. Their enclosure restricts cooling.</w:t>
             </w:r>
           </w:p>
         </w:tc>
@@ -1717,51 +1437,51 @@
         </w:trPr>
         <w:tc>
           <w:tcPr>
-            <w:tcW w:type="dxa" w:w="2523"/>
+            <w:tcW w:type="dxa" w:w="2353"/>
           </w:tcPr>
           <w:p>
             <w:pPr>
-              <w:spacing w:before="60" w:after="80" w:line="259" w:lineRule="auto"/>
+              <w:spacing w:before="40" w:after="60" w:line="250" w:lineRule="auto"/>
             </w:pPr>
             <w:r>
               <w:rPr>
-                <w:sz w:val="19"/>
+                <w:sz w:val="18"/>
               </w:rPr>
-              <w:t>18 Fire and explosion conditions</w:t>
+              <w:t>Methods 4, 6, 15</w:t>
               <w:br/>
-              <w:t>火灾及爆炸条件</w:t>
+              <w:t>隔热墙或天花内</w:t>
             </w:r>
           </w:p>
         </w:tc>
         <w:tc>
           <w:tcPr>
-            <w:tcW w:type="dxa" w:w="3005"/>
+            <w:tcW w:type="dxa" w:w="3203"/>
           </w:tcPr>
           <w:p>
             <w:pPr>
-              <w:spacing w:before="60" w:after="80" w:line="259" w:lineRule="auto"/>
+              <w:spacing w:before="40" w:after="60" w:line="250" w:lineRule="auto"/>
             </w:pPr>
             <w:r>
               <w:rPr>
-                <w:sz w:val="19"/>
+                <w:sz w:val="18"/>
               </w:rPr>
-              <w:t>应考虑火焰蔓延及烟气影响。消防或应急回路还须考虑规定条件下的供电连续性。存在可燃气体或粉尘时，电缆、进线装置及布线系统须适合相应危险条件。</w:t>
+              <w:t>所示隔热墙或天花布置采用参考Method 4，须符合一侧导热接触等图示条件。不能直接使用开放敷设栏位。</w:t>
             </w:r>
           </w:p>
         </w:tc>
         <w:tc>
           <w:tcPr>
-            <w:tcW w:type="dxa" w:w="4847"/>
+            <w:tcW w:type="dxa" w:w="4876"/>
           </w:tcPr>
           <w:p>
             <w:pPr>
-              <w:spacing w:before="60" w:after="80" w:line="259" w:lineRule="auto"/>
+              <w:spacing w:before="40" w:after="60" w:line="250" w:lineRule="auto"/>
             </w:pPr>
             <w:r>
               <w:rPr>
-                <w:sz w:val="19"/>
+                <w:sz w:val="18"/>
               </w:rPr>
-              <w:t>Consider flame spread and smoke effects. Fire-service or emergency circuits may also require continuity of supply under specified fire conditions. Where flammable gases or dusts are present, cables, entries and the wiring system must suit the hazardous conditions.</w:t>
+              <w:t>The specified insulated-wall or ceiling arrangements use reference Method 4, subject to their contact and heat-transfer conditions.</w:t>
             </w:r>
           </w:p>
         </w:tc>
@@ -1772,51 +1492,51 @@
         </w:trPr>
         <w:tc>
           <w:tcPr>
-            <w:tcW w:type="dxa" w:w="2523"/>
+            <w:tcW w:type="dxa" w:w="2353"/>
           </w:tcPr>
           <w:p>
             <w:pPr>
-              <w:spacing w:before="60" w:after="80" w:line="259" w:lineRule="auto"/>
+              <w:spacing w:before="40" w:after="60" w:line="250" w:lineRule="auto"/>
             </w:pPr>
             <w:r>
               <w:rPr>
-                <w:sz w:val="19"/>
+                <w:sz w:val="18"/>
               </w:rPr>
-              <w:t>19 Terminations and installation feasibility</w:t>
+              <w:t>Method 11</w:t>
               <w:br/>
-              <w:t>端接及安装可行性</w:t>
+              <w:t>有孔桥架</w:t>
             </w:r>
           </w:p>
         </w:tc>
         <w:tc>
           <w:tcPr>
-            <w:tcW w:type="dxa" w:w="3005"/>
+            <w:tcW w:type="dxa" w:w="3203"/>
           </w:tcPr>
           <w:p>
             <w:pPr>
-              <w:spacing w:before="60" w:after="80" w:line="259" w:lineRule="auto"/>
+              <w:spacing w:before="40" w:after="60" w:line="250" w:lineRule="auto"/>
             </w:pPr>
             <w:r>
               <w:rPr>
-                <w:sz w:val="19"/>
+                <w:sz w:val="18"/>
               </w:rPr>
-              <w:t>截面及电缆外径应与端子、接线耳、格兰头和管槽容量匹配，并满足弯曲、牵引和支承条件。端接不良会产生局部过热；路线也应便于检查、测试和维修。</w:t>
+              <w:t>所示有孔桥架采用Method 11。附图将开孔面积至少占30%的桥架定义为有孔桥架；还须匹配单层、接触、方向等条件。</w:t>
             </w:r>
           </w:p>
         </w:tc>
         <w:tc>
           <w:tcPr>
-            <w:tcW w:type="dxa" w:w="4847"/>
+            <w:tcW w:type="dxa" w:w="4876"/>
           </w:tcPr>
           <w:p>
             <w:pPr>
-              <w:spacing w:before="60" w:after="80" w:line="259" w:lineRule="auto"/>
+              <w:spacing w:before="40" w:after="60" w:line="250" w:lineRule="auto"/>
             </w:pPr>
             <w:r>
               <w:rPr>
-                <w:sz w:val="19"/>
+                <w:sz w:val="18"/>
               </w:rPr>
-              <w:t>The conductor size and cable diameter must suit terminals, lugs, glands and containment capacity, as well as bending, pulling and support conditions. Poor terminations cause local overheating. The route should also permit inspection, testing and maintenance.</w:t>
+              <w:t>Use Method 11 for the stated perforated-tray arrangement. The figure defines a perforated tray as having holes occupying at least 30% of its surface; layout, touching and orientation also matter.</w:t>
             </w:r>
           </w:p>
         </w:tc>
@@ -1827,51 +1547,466 @@
         </w:trPr>
         <w:tc>
           <w:tcPr>
-            <w:tcW w:type="dxa" w:w="2523"/>
+            <w:tcW w:type="dxa" w:w="2353"/>
           </w:tcPr>
           <w:p>
             <w:pPr>
-              <w:spacing w:before="60" w:after="80" w:line="259" w:lineRule="auto"/>
+              <w:spacing w:before="40" w:after="60" w:line="250" w:lineRule="auto"/>
             </w:pPr>
             <w:r>
               <w:rPr>
-                <w:sz w:val="19"/>
+                <w:sz w:val="18"/>
               </w:rPr>
-              <w:t>20 Future loading and alterations</w:t>
+              <w:t>Methods 12–14</w:t>
               <w:br/>
-              <w:t>未来负荷及改造</w:t>
+              <w:t>自由空气及梯架</w:t>
             </w:r>
           </w:p>
         </w:tc>
         <w:tc>
           <w:tcPr>
-            <w:tcW w:type="dxa" w:w="3005"/>
+            <w:tcW w:type="dxa" w:w="3203"/>
           </w:tcPr>
           <w:p>
             <w:pPr>
-              <w:spacing w:before="60" w:after="80" w:line="259" w:lineRule="auto"/>
+              <w:spacing w:before="40" w:after="60" w:line="250" w:lineRule="auto"/>
             </w:pPr>
             <w:r>
               <w:rPr>
-                <w:sz w:val="19"/>
+                <w:sz w:val="18"/>
               </w:rPr>
-              <w:t>如有明确扩建计划，应预留合理的负荷及布线空间。新增回路或提高保护整定值后，必须重新检查负载、成组修正、压降及故障条件，以保持整条回路协调。</w:t>
+              <w:t>Method 12用于图示带护套单芯电缆，Method 13用于图示多芯布置；悬挂方式14按12或13处理。须满足间距及支承遮挡条件，包括图示支承金属占平面面积小于10%。</w:t>
             </w:r>
           </w:p>
         </w:tc>
         <w:tc>
           <w:tcPr>
-            <w:tcW w:type="dxa" w:w="4847"/>
+            <w:tcW w:type="dxa" w:w="4876"/>
           </w:tcPr>
           <w:p>
             <w:pPr>
-              <w:spacing w:before="60" w:after="80" w:line="259" w:lineRule="auto"/>
+              <w:spacing w:before="40" w:after="60" w:line="250" w:lineRule="auto"/>
             </w:pPr>
             <w:r>
               <w:rPr>
-                <w:sz w:val="19"/>
+                <w:sz w:val="18"/>
               </w:rPr>
-              <w:t>Where expansion is planned, allow reasonably for future load and cable space. Adding circuits or increasing protection settings requires reassessment of loading, grouping, voltage drop and fault conditions so that the complete circuit remains coordinated.</w:t>
+              <w:t>Method 12 covers the shown sheathed single-core arrangement and Method 13 the multicore arrangement. Method 14 uses 12 or 13 as appropriate. Match the stated clearances and supporting-metalwork restriction, including less than 10% plan-area obstruction where specified.</w:t>
+            </w:r>
+          </w:p>
+        </w:tc>
+      </w:tr>
+      <w:tr>
+        <w:trPr>
+          <w:cantSplit/>
+        </w:trPr>
+        <w:tc>
+          <w:tcPr>
+            <w:tcW w:type="dxa" w:w="2353"/>
+          </w:tcPr>
+          <w:p>
+            <w:pPr>
+              <w:spacing w:before="40" w:after="60" w:line="250" w:lineRule="auto"/>
+            </w:pPr>
+            <w:r>
+              <w:rPr>
+                <w:sz w:val="18"/>
+              </w:rPr>
+              <w:t>Method 16</w:t>
+              <w:br/>
+              <w:t>建筑孔洞内</w:t>
+            </w:r>
+          </w:p>
+        </w:tc>
+        <w:tc>
+          <w:tcPr>
+            <w:tcW w:type="dxa" w:w="3203"/>
+          </w:tcPr>
+          <w:p>
+            <w:pPr>
+              <w:spacing w:before="40" w:after="60" w:line="250" w:lineRule="auto"/>
+            </w:pPr>
+            <w:r>
+              <w:rPr>
+                <w:sz w:val="18"/>
+              </w:rPr>
+              <w:t>非隔热结构孔洞按尺寸选参考方法：图示直径不大于5De或周长不大于20De时采用4，超过相应界限时采用3；周长超过60De则按适合的18–20处理。De的组缆定义也须依表注。</w:t>
+            </w:r>
+          </w:p>
+        </w:tc>
+        <w:tc>
+          <w:tcPr>
+            <w:tcW w:type="dxa" w:w="4876"/>
+          </w:tcPr>
+          <w:p>
+            <w:pPr>
+              <w:spacing w:before="40" w:after="60" w:line="250" w:lineRule="auto"/>
+            </w:pPr>
+            <w:r>
+              <w:rPr>
+                <w:sz w:val="18"/>
+              </w:rPr>
+              <w:t>For the stated non-insulating building void, the small-void limits are 5De in diameter or 20De in perimeter for Method 4; beyond the relevant limit, Method 3 applies. Perimeter exceeding 60De invokes an appropriate Method 18–20. Use the stated group definition of De.</w:t>
+            </w:r>
+          </w:p>
+        </w:tc>
+      </w:tr>
+      <w:tr>
+        <w:trPr>
+          <w:cantSplit/>
+        </w:trPr>
+        <w:tc>
+          <w:tcPr>
+            <w:tcW w:type="dxa" w:w="2353"/>
+          </w:tcPr>
+          <w:p>
+            <w:pPr>
+              <w:spacing w:before="40" w:after="60" w:line="250" w:lineRule="auto"/>
+            </w:pPr>
+            <w:r>
+              <w:rPr>
+                <w:sz w:val="18"/>
+              </w:rPr>
+              <w:t>Method 17</w:t>
+              <w:br/>
+              <w:t>开放或通风地沟</w:t>
+            </w:r>
+          </w:p>
+        </w:tc>
+        <w:tc>
+          <w:tcPr>
+            <w:tcW w:type="dxa" w:w="3203"/>
+          </w:tcPr>
+          <w:p>
+            <w:pPr>
+              <w:spacing w:before="40" w:after="60" w:line="250" w:lineRule="auto"/>
+            </w:pPr>
+            <w:r>
+              <w:rPr>
+                <w:sz w:val="18"/>
+              </w:rPr>
+              <w:t>按图示支承及间距采用Method 12或13。通风及净距条件必须实际满足。</w:t>
+            </w:r>
+          </w:p>
+        </w:tc>
+        <w:tc>
+          <w:tcPr>
+            <w:tcW w:type="dxa" w:w="4876"/>
+          </w:tcPr>
+          <w:p>
+            <w:pPr>
+              <w:spacing w:before="40" w:after="60" w:line="250" w:lineRule="auto"/>
+            </w:pPr>
+            <w:r>
+              <w:rPr>
+                <w:sz w:val="18"/>
+              </w:rPr>
+              <w:t>An open or ventilated trench uses Method 12 or 13 with the specified support and spacing. The ventilation and clearances must actually be provided.</w:t>
+            </w:r>
+          </w:p>
+        </w:tc>
+      </w:tr>
+      <w:tr>
+        <w:trPr>
+          <w:cantSplit/>
+        </w:trPr>
+        <w:tc>
+          <w:tcPr>
+            <w:tcW w:type="dxa" w:w="2353"/>
+          </w:tcPr>
+          <w:p>
+            <w:pPr>
+              <w:spacing w:before="40" w:after="60" w:line="250" w:lineRule="auto"/>
+            </w:pPr>
+            <w:r>
+              <w:rPr>
+                <w:sz w:val="18"/>
+              </w:rPr>
+              <w:t>Methods 18–20</w:t>
+              <w:br/>
+              <w:t>封闭地沟</w:t>
+            </w:r>
+          </w:p>
+        </w:tc>
+        <w:tc>
+          <w:tcPr>
+            <w:tcW w:type="dxa" w:w="3203"/>
+          </w:tcPr>
+          <w:p>
+            <w:pPr>
+              <w:spacing w:before="40" w:after="60" w:line="250" w:lineRule="auto"/>
+            </w:pPr>
+            <w:r>
+              <w:rPr>
+                <w:sz w:val="18"/>
+              </w:rPr>
+              <w:t>采用所示地沟布置及A5(6)，核对盖板、尺寸、间距和组数。该类布置须作专用修正，不能仅因电缆装在梯架上便按无围护的额定值使用。</w:t>
+            </w:r>
+          </w:p>
+        </w:tc>
+        <w:tc>
+          <w:tcPr>
+            <w:tcW w:type="dxa" w:w="4876"/>
+          </w:tcPr>
+          <w:p>
+            <w:pPr>
+              <w:spacing w:before="40" w:after="60" w:line="250" w:lineRule="auto"/>
+            </w:pPr>
+            <w:r>
+              <w:rPr>
+                <w:sz w:val="18"/>
+              </w:rPr>
+              <w:t>Use the depicted enclosed-trench arrangement and A5(6), checking cover, dimensions, spacing and group count. The presence of ladder supports does not remove the enclosed-trench correction.</w:t>
+            </w:r>
+          </w:p>
+        </w:tc>
+      </w:tr>
+    </w:tbl>
+    <w:p>
+      <w:r>
+        <w:br w:type="page"/>
+      </w:r>
+    </w:p>
+    <w:p>
+      <w:pPr>
+        <w:pStyle w:val="Heading1"/>
+      </w:pPr>
+      <w:r>
+        <w:t>6 Table A6(1)：电缆规格、载流量与压降</w:t>
+        <w:br/>
+        <w:t>Cable specification, current rating and voltage drop</w:t>
+      </w:r>
+    </w:p>
+    <w:p>
+      <w:r>
+        <w:t>本表主要适用于铜导体、单芯、PVC绝缘、非铠装电缆，可带或不带护套。载流量以环境30°C、导体70°C为参考，必须按电缆截面、相制、导体数量及参考Method选正确栏位。</w:t>
+      </w:r>
+    </w:p>
+    <w:p>
+      <w:r>
+        <w:t>The main table covers single-core, PVC-insulated, non-armoured copper cables, with or without sheath. Its current ratings use 30°C ambient and 70°C conductor temperature. Select the correct column for size, phase arrangement, conductor count and reference Method.</w:t>
+      </w:r>
+    </w:p>
+    <w:tbl>
+      <w:tblPr>
+        <w:tblStyle w:val="TableGrid"/>
+        <w:tblW w:type="auto" w:w="0"/>
+        <w:tblLayout w:type="fixed"/>
+        <w:tblLook w:firstColumn="1" w:firstRow="1" w:lastColumn="0" w:lastRow="0" w:noHBand="0" w:noVBand="1" w:val="04A0"/>
+      </w:tblPr>
+      <w:tblGrid>
+        <w:gridCol w:w="2353"/>
+        <w:gridCol w:w="3203"/>
+        <w:gridCol w:w="4876"/>
+      </w:tblGrid>
+      <w:tr>
+        <w:trPr>
+          <w:tblHeader/>
+        </w:trPr>
+        <w:tc>
+          <w:tcPr>
+            <w:tcW w:type="dxa" w:w="2353"/>
+            <w:shd w:fill="E7EDF2"/>
+          </w:tcPr>
+          <w:p>
+            <w:r>
+              <w:rPr>
+                <w:b/>
+              </w:rPr>
+              <w:t>因素 / Factor</w:t>
+            </w:r>
+          </w:p>
+        </w:tc>
+        <w:tc>
+          <w:tcPr>
+            <w:tcW w:type="dxa" w:w="3203"/>
+            <w:shd w:fill="E7EDF2"/>
+          </w:tcPr>
+          <w:p>
+            <w:r>
+              <w:rPr>
+                <w:b/>
+              </w:rPr>
+              <w:t>定性解释</w:t>
+            </w:r>
+          </w:p>
+        </w:tc>
+        <w:tc>
+          <w:tcPr>
+            <w:tcW w:type="dxa" w:w="4876"/>
+            <w:shd w:fill="E7EDF2"/>
+          </w:tcPr>
+          <w:p>
+            <w:r>
+              <w:rPr>
+                <w:b/>
+              </w:rPr>
+              <w:t>Qualitative explanation</w:t>
+            </w:r>
+          </w:p>
+        </w:tc>
+      </w:tr>
+      <w:tr>
+        <w:trPr>
+          <w:cantSplit/>
+        </w:trPr>
+        <w:tc>
+          <w:tcPr>
+            <w:tcW w:type="dxa" w:w="2353"/>
+          </w:tcPr>
+          <w:p>
+            <w:pPr>
+              <w:spacing w:before="40" w:after="60" w:line="250" w:lineRule="auto"/>
+            </w:pPr>
+            <w:r>
+              <w:rPr>
+                <w:sz w:val="18"/>
+              </w:rPr>
+              <w:t>Cable type and table notes</w:t>
+              <w:br/>
+              <w:t>类型及表注</w:t>
+            </w:r>
+          </w:p>
+        </w:tc>
+        <w:tc>
+          <w:tcPr>
+            <w:tcW w:type="dxa" w:w="3203"/>
+          </w:tcPr>
+          <w:p>
+            <w:pPr>
+              <w:spacing w:before="40" w:after="60" w:line="250" w:lineRule="auto"/>
+            </w:pPr>
+            <w:r>
+              <w:rPr>
+                <w:sz w:val="18"/>
+              </w:rPr>
+              <w:t>铝、多芯、XLPE或铠装结构须采用适用额定资料。表注仅允许指定BS 6004柔性电缆及BS 6231的85／90°C耐热PVC在固定安装时使用第2–5栏载流量，不能将该许可扩展至所有栏位。</w:t>
+            </w:r>
+          </w:p>
+        </w:tc>
+        <w:tc>
+          <w:tcPr>
+            <w:tcW w:type="dxa" w:w="4876"/>
+          </w:tcPr>
+          <w:p>
+            <w:pPr>
+              <w:spacing w:before="40" w:after="60" w:line="250" w:lineRule="auto"/>
+            </w:pPr>
+            <w:r>
+              <w:rPr>
+                <w:sz w:val="18"/>
+              </w:rPr>
+              <w:t>Use appropriate rating data for aluminium, multicore, XLPE or armoured constructions. The note permits only the specified BS 6004 flexible and BS 6231 85/90°C heat-resisting PVC cables to use columns 2–5 for fixed installations; that permission is column- and application-specific.</w:t>
+            </w:r>
+          </w:p>
+        </w:tc>
+      </w:tr>
+      <w:tr>
+        <w:trPr>
+          <w:cantSplit/>
+        </w:trPr>
+        <w:tc>
+          <w:tcPr>
+            <w:tcW w:type="dxa" w:w="2353"/>
+          </w:tcPr>
+          <w:p>
+            <w:pPr>
+              <w:spacing w:before="40" w:after="60" w:line="250" w:lineRule="auto"/>
+            </w:pPr>
+            <w:r>
+              <w:rPr>
+                <w:sz w:val="18"/>
+              </w:rPr>
+              <w:t>Current rating and layout</w:t>
+              <w:br/>
+              <w:t>载流量及排列</w:t>
+            </w:r>
+          </w:p>
+        </w:tc>
+        <w:tc>
+          <w:tcPr>
+            <w:tcW w:type="dxa" w:w="3203"/>
+          </w:tcPr>
+          <w:p>
+            <w:pPr>
+              <w:spacing w:before="40" w:after="60" w:line="250" w:lineRule="auto"/>
+            </w:pPr>
+            <w:r>
+              <w:rPr>
+                <w:sz w:val="18"/>
+              </w:rPr>
+              <w:t>相同截面并无单一固定载流量。Method、单相或三相、接触或分隔及平面或三叶排列都会影响额定值。表中“—”没有提供该组合的数据，须另取适用资料。</w:t>
+            </w:r>
+          </w:p>
+        </w:tc>
+        <w:tc>
+          <w:tcPr>
+            <w:tcW w:type="dxa" w:w="4876"/>
+          </w:tcPr>
+          <w:p>
+            <w:pPr>
+              <w:spacing w:before="40" w:after="60" w:line="250" w:lineRule="auto"/>
+            </w:pPr>
+            <w:r>
+              <w:rPr>
+                <w:sz w:val="18"/>
+              </w:rPr>
+              <w:t>A conductor size has no single universal current rating. Method, phase arrangement, spacing and flat or trefoil formation affect the rating. A dash supplies no rating for that combination; obtain applicable data rather than borrowing another column.</w:t>
+            </w:r>
+          </w:p>
+        </w:tc>
+      </w:tr>
+      <w:tr>
+        <w:trPr>
+          <w:cantSplit/>
+        </w:trPr>
+        <w:tc>
+          <w:tcPr>
+            <w:tcW w:type="dxa" w:w="2353"/>
+          </w:tcPr>
+          <w:p>
+            <w:pPr>
+              <w:spacing w:before="40" w:after="60" w:line="250" w:lineRule="auto"/>
+            </w:pPr>
+            <w:r>
+              <w:rPr>
+                <w:sz w:val="18"/>
+              </w:rPr>
+              <w:t>Length and voltage drop</w:t>
+              <w:br/>
+              <w:t>长度及压降</w:t>
+            </w:r>
+          </w:p>
+        </w:tc>
+        <w:tc>
+          <w:tcPr>
+            <w:tcW w:type="dxa" w:w="3203"/>
+          </w:tcPr>
+          <w:p>
+            <w:pPr>
+              <w:spacing w:before="40" w:after="60" w:line="250" w:lineRule="auto"/>
+            </w:pPr>
+            <w:r>
+              <w:rPr>
+                <w:sz w:val="18"/>
+              </w:rPr>
+              <w:t>较长线路和较大电流通常增加压降。压降页以mV/A/m列值，须匹配直流、单相或三相及排列。较大截面列出r、x、z，分别表示电阻、电抗及阻抗；交流负载的功率因数也须纳入判断。</w:t>
+            </w:r>
+          </w:p>
+        </w:tc>
+        <w:tc>
+          <w:tcPr>
+            <w:tcW w:type="dxa" w:w="4876"/>
+          </w:tcPr>
+          <w:p>
+            <w:pPr>
+              <w:spacing w:before="40" w:after="60" w:line="250" w:lineRule="auto"/>
+            </w:pPr>
+            <w:r>
+              <w:rPr>
+                <w:sz w:val="18"/>
+              </w:rPr>
+              <w:t>Longer routes and higher current generally increase voltage drop. Use the mV/A/m column for the correct d.c. or a.c. phase and formation. Larger sizes distinguish resistance r, reactance x and impedance z; load power factor also requires consideration.</w:t>
             </w:r>
           </w:p>
         </w:tc>
@@ -1882,24 +2017,676 @@
         <w:pStyle w:val="Heading2"/>
       </w:pPr>
       <w:r>
-        <w:t>选择顺序 / Selection sequence</w:t>
+        <w:t>相同4mm²截面的定性比较 / Comparing the same 4mm² size</w:t>
+      </w:r>
+    </w:p>
+    <w:tbl>
+      <w:tblPr>
+        <w:tblStyle w:val="TableGrid"/>
+        <w:tblW w:type="auto" w:w="0"/>
+        <w:tblLayout w:type="fixed"/>
+        <w:tblLook w:firstColumn="1" w:firstRow="1" w:lastColumn="0" w:lastRow="0" w:noHBand="0" w:noVBand="1" w:val="04A0"/>
+      </w:tblPr>
+      <w:tblGrid>
+        <w:gridCol w:w="2353"/>
+        <w:gridCol w:w="2268"/>
+        <w:gridCol w:w="5811"/>
+      </w:tblGrid>
+      <w:tr>
+        <w:trPr>
+          <w:tblHeader/>
+        </w:trPr>
+        <w:tc>
+          <w:tcPr>
+            <w:tcW w:type="dxa" w:w="2353"/>
+            <w:shd w:fill="E7EDF2"/>
+          </w:tcPr>
+          <w:p>
+            <w:r>
+              <w:rPr>
+                <w:b/>
+              </w:rPr>
+              <w:t>参考方法 / Reference method</w:t>
+            </w:r>
+          </w:p>
+        </w:tc>
+        <w:tc>
+          <w:tcPr>
+            <w:tcW w:type="dxa" w:w="2268"/>
+            <w:shd w:fill="E7EDF2"/>
+          </w:tcPr>
+          <w:p>
+            <w:r>
+              <w:rPr>
+                <w:b/>
+              </w:rPr>
+              <w:t>三相基准载流量</w:t>
+              <w:br/>
+              <w:t>Three-phase base rating</w:t>
+            </w:r>
+          </w:p>
+        </w:tc>
+        <w:tc>
+          <w:tcPr>
+            <w:tcW w:type="dxa" w:w="5811"/>
+            <w:shd w:fill="E7EDF2"/>
+          </w:tcPr>
+          <w:p>
+            <w:r>
+              <w:rPr>
+                <w:b/>
+              </w:rPr>
+              <w:t>含义 / Meaning</w:t>
+            </w:r>
+          </w:p>
+        </w:tc>
+      </w:tr>
+      <w:tr>
+        <w:trPr>
+          <w:cantSplit/>
+        </w:trPr>
+        <w:tc>
+          <w:tcPr>
+            <w:tcW w:type="dxa" w:w="2353"/>
+          </w:tcPr>
+          <w:p>
+            <w:pPr>
+              <w:spacing w:before="40" w:after="60" w:line="250" w:lineRule="auto"/>
+            </w:pPr>
+            <w:r>
+              <w:rPr>
+                <w:sz w:val="18"/>
+              </w:rPr>
+              <w:t>Method 4</w:t>
+            </w:r>
+          </w:p>
+        </w:tc>
+        <w:tc>
+          <w:tcPr>
+            <w:tcW w:type="dxa" w:w="2268"/>
+          </w:tcPr>
+          <w:p>
+            <w:pPr>
+              <w:spacing w:before="40" w:after="60" w:line="250" w:lineRule="auto"/>
+            </w:pPr>
+            <w:r>
+              <w:rPr>
+                <w:sz w:val="18"/>
+              </w:rPr>
+              <w:t>24A</w:t>
+            </w:r>
+          </w:p>
+        </w:tc>
+        <w:tc>
+          <w:tcPr>
+            <w:tcW w:type="dxa" w:w="5811"/>
+          </w:tcPr>
+          <w:p>
+            <w:pPr>
+              <w:spacing w:before="40" w:after="60" w:line="250" w:lineRule="auto"/>
+            </w:pPr>
+            <w:r>
+              <w:rPr>
+                <w:sz w:val="18"/>
+              </w:rPr>
+              <w:t>隔热墙内管道，散热受限 / Conduit in a thermally insulating wall.</w:t>
+            </w:r>
+          </w:p>
+        </w:tc>
+      </w:tr>
+      <w:tr>
+        <w:trPr>
+          <w:cantSplit/>
+        </w:trPr>
+        <w:tc>
+          <w:tcPr>
+            <w:tcW w:type="dxa" w:w="2353"/>
+          </w:tcPr>
+          <w:p>
+            <w:pPr>
+              <w:spacing w:before="40" w:after="60" w:line="250" w:lineRule="auto"/>
+            </w:pPr>
+            <w:r>
+              <w:rPr>
+                <w:sz w:val="18"/>
+              </w:rPr>
+              <w:t>Method 3</w:t>
+            </w:r>
+          </w:p>
+        </w:tc>
+        <w:tc>
+          <w:tcPr>
+            <w:tcW w:type="dxa" w:w="2268"/>
+          </w:tcPr>
+          <w:p>
+            <w:pPr>
+              <w:spacing w:before="40" w:after="60" w:line="250" w:lineRule="auto"/>
+            </w:pPr>
+            <w:r>
+              <w:rPr>
+                <w:sz w:val="18"/>
+              </w:rPr>
+              <w:t>28A</w:t>
+            </w:r>
+          </w:p>
+        </w:tc>
+        <w:tc>
+          <w:tcPr>
+            <w:tcW w:type="dxa" w:w="5811"/>
+          </w:tcPr>
+          <w:p>
+            <w:pPr>
+              <w:spacing w:before="40" w:after="60" w:line="250" w:lineRule="auto"/>
+            </w:pPr>
+            <w:r>
+              <w:rPr>
+                <w:sz w:val="18"/>
+              </w:rPr>
+              <w:t>一般墙面管道或线槽 / Conduit on a wall or trunking.</w:t>
+            </w:r>
+          </w:p>
+        </w:tc>
+      </w:tr>
+      <w:tr>
+        <w:trPr>
+          <w:cantSplit/>
+        </w:trPr>
+        <w:tc>
+          <w:tcPr>
+            <w:tcW w:type="dxa" w:w="2353"/>
+          </w:tcPr>
+          <w:p>
+            <w:pPr>
+              <w:spacing w:before="40" w:after="60" w:line="250" w:lineRule="auto"/>
+            </w:pPr>
+            <w:r>
+              <w:rPr>
+                <w:sz w:val="18"/>
+              </w:rPr>
+              <w:t>Method 1</w:t>
+            </w:r>
+          </w:p>
+        </w:tc>
+        <w:tc>
+          <w:tcPr>
+            <w:tcW w:type="dxa" w:w="2268"/>
+          </w:tcPr>
+          <w:p>
+            <w:pPr>
+              <w:spacing w:before="40" w:after="60" w:line="250" w:lineRule="auto"/>
+            </w:pPr>
+            <w:r>
+              <w:rPr>
+                <w:sz w:val="18"/>
+              </w:rPr>
+              <w:t>33A</w:t>
+            </w:r>
+          </w:p>
+        </w:tc>
+        <w:tc>
+          <w:tcPr>
+            <w:tcW w:type="dxa" w:w="5811"/>
+          </w:tcPr>
+          <w:p>
+            <w:pPr>
+              <w:spacing w:before="40" w:after="60" w:line="250" w:lineRule="auto"/>
+            </w:pPr>
+            <w:r>
+              <w:rPr>
+                <w:sz w:val="18"/>
+              </w:rPr>
+              <w:t>直接固定，散热较开放 / Clipped direct, with more open cooling.</w:t>
+            </w:r>
+          </w:p>
+        </w:tc>
+      </w:tr>
+    </w:tbl>
+    <w:p>
+      <w:r>
+        <w:t>这些是三相基准值，使用前仍须作适用修正。同一4mm²在压降页的三相值为9.5mV/A/m，单相为11mV/A/m。间距增大虽可改善散热，但表注指出超过Method 12规定的间距会使压降增大，须同时检查两者。</w:t>
       </w:r>
     </w:p>
     <w:p>
       <w:r>
-        <w:t>先确定实际负载及设计电流，再选择适合工业环境的电缆结构和安装方法；随后按正确表格及适用修正系数核查载流量，并检查压降、故障保护、损耗及端接条件。最终选用同时满足这些要求的规格。</w:t>
+        <w:t>These are three-phase base ratings before correction. The 4mm² voltage-drop entries are 9.5mV/A/m for three-phase and 11mV/A/m for single-phase. Greater spacing may improve cooling, but spacing beyond Method 12 increases voltage drop according to the note. Check both effects.</w:t>
       </w:r>
     </w:p>
     <w:p>
       <w:r>
-        <w:t>Establish the actual load and design current, then select the cable construction and installation method for the industrial environment. Check current-carrying capacity using the correct table and applicable corrections, followed by voltage drop, fault protection, losses and termination conditions. Select a size that satisfies these requirements together.</w:t>
+        <w:t>上游与下游压降应合并检查；电动机回路还应核查启动期间的电压下降。</w:t>
+      </w:r>
+    </w:p>
+    <w:p>
+      <w:r>
+        <w:t>Check upstream and downstream voltage drop together. Motor circuits also require a starting-voltage check.</w:t>
+      </w:r>
+    </w:p>
+    <w:p>
+      <w:r>
+        <w:br w:type="page"/>
+      </w:r>
+    </w:p>
+    <w:p>
+      <w:pPr>
+        <w:pStyle w:val="Heading1"/>
+      </w:pPr>
+      <w:r>
+        <w:t>7 工业环境中的其他约束 / Additional industrial constraints</w:t>
+      </w:r>
+    </w:p>
+    <w:tbl>
+      <w:tblPr>
+        <w:tblStyle w:val="TableGrid"/>
+        <w:tblW w:type="auto" w:w="0"/>
+        <w:tblLayout w:type="fixed"/>
+        <w:tblLook w:firstColumn="1" w:firstRow="1" w:lastColumn="0" w:lastRow="0" w:noHBand="0" w:noVBand="1" w:val="04A0"/>
+      </w:tblPr>
+      <w:tblGrid>
+        <w:gridCol w:w="2353"/>
+        <w:gridCol w:w="3203"/>
+        <w:gridCol w:w="4876"/>
+      </w:tblGrid>
+      <w:tr>
+        <w:trPr>
+          <w:tblHeader/>
+        </w:trPr>
+        <w:tc>
+          <w:tcPr>
+            <w:tcW w:type="dxa" w:w="2353"/>
+            <w:shd w:fill="E7EDF2"/>
+          </w:tcPr>
+          <w:p>
+            <w:r>
+              <w:rPr>
+                <w:b/>
+              </w:rPr>
+              <w:t>因素 / Factor</w:t>
+            </w:r>
+          </w:p>
+        </w:tc>
+        <w:tc>
+          <w:tcPr>
+            <w:tcW w:type="dxa" w:w="3203"/>
+            <w:shd w:fill="E7EDF2"/>
+          </w:tcPr>
+          <w:p>
+            <w:r>
+              <w:rPr>
+                <w:b/>
+              </w:rPr>
+              <w:t>定性解释</w:t>
+            </w:r>
+          </w:p>
+        </w:tc>
+        <w:tc>
+          <w:tcPr>
+            <w:tcW w:type="dxa" w:w="4876"/>
+            <w:shd w:fill="E7EDF2"/>
+          </w:tcPr>
+          <w:p>
+            <w:r>
+              <w:rPr>
+                <w:b/>
+              </w:rPr>
+              <w:t>Qualitative explanation</w:t>
+            </w:r>
+          </w:p>
+        </w:tc>
+      </w:tr>
+      <w:tr>
+        <w:trPr>
+          <w:cantSplit/>
+        </w:trPr>
+        <w:tc>
+          <w:tcPr>
+            <w:tcW w:type="dxa" w:w="2353"/>
+          </w:tcPr>
+          <w:p>
+            <w:pPr>
+              <w:spacing w:before="40" w:after="60" w:line="250" w:lineRule="auto"/>
+            </w:pPr>
+            <w:r>
+              <w:rPr>
+                <w:sz w:val="18"/>
+              </w:rPr>
+              <w:t>Fault withstand and protection</w:t>
+              <w:br/>
+              <w:t>故障承受与保护</w:t>
+            </w:r>
+          </w:p>
+        </w:tc>
+        <w:tc>
+          <w:tcPr>
+            <w:tcW w:type="dxa" w:w="3203"/>
+          </w:tcPr>
+          <w:p>
+            <w:pPr>
+              <w:spacing w:before="40" w:after="60" w:line="250" w:lineRule="auto"/>
+            </w:pPr>
+            <w:r>
+              <w:rPr>
+                <w:sz w:val="18"/>
+              </w:rPr>
+              <w:t>导体及绝缘须承受故障切除前的热应力，保护器件分断能力须足够。还须检查故障环路阻抗、保护导体连续性及切除条件；载流量合格并不代表故障保护已合格。</w:t>
+            </w:r>
+          </w:p>
+        </w:tc>
+        <w:tc>
+          <w:tcPr>
+            <w:tcW w:type="dxa" w:w="4876"/>
+          </w:tcPr>
+          <w:p>
+            <w:pPr>
+              <w:spacing w:before="40" w:after="60" w:line="250" w:lineRule="auto"/>
+            </w:pPr>
+            <w:r>
+              <w:rPr>
+                <w:sz w:val="18"/>
+              </w:rPr>
+              <w:t>The conductor and insulation must withstand fault energy until disconnection, and the protective device needs adequate breaking capacity. Check loop impedance, protective-conductor continuity and disconnection conditions in addition to normal current capacity.</w:t>
+            </w:r>
+          </w:p>
+        </w:tc>
+      </w:tr>
+      <w:tr>
+        <w:trPr>
+          <w:cantSplit/>
+        </w:trPr>
+        <w:tc>
+          <w:tcPr>
+            <w:tcW w:type="dxa" w:w="2353"/>
+          </w:tcPr>
+          <w:p>
+            <w:pPr>
+              <w:spacing w:before="40" w:after="60" w:line="250" w:lineRule="auto"/>
+            </w:pPr>
+            <w:r>
+              <w:rPr>
+                <w:sz w:val="18"/>
+              </w:rPr>
+              <w:t>External influences</w:t>
+              <w:br/>
+              <w:t>外部环境</w:t>
+            </w:r>
+          </w:p>
+        </w:tc>
+        <w:tc>
+          <w:tcPr>
+            <w:tcW w:type="dxa" w:w="3203"/>
+          </w:tcPr>
+          <w:p>
+            <w:pPr>
+              <w:spacing w:before="40" w:after="60" w:line="250" w:lineRule="auto"/>
+            </w:pPr>
+            <w:r>
+              <w:rPr>
+                <w:sz w:val="18"/>
+              </w:rPr>
+              <w:t>潮湿、水、油、腐蚀性气体、化学品、粉尘和外部热源影响绝缘及护套寿命。须选择相容材料及密封防护，增大导体截面不能替代环境适用性。</w:t>
+            </w:r>
+          </w:p>
+        </w:tc>
+        <w:tc>
+          <w:tcPr>
+            <w:tcW w:type="dxa" w:w="4876"/>
+          </w:tcPr>
+          <w:p>
+            <w:pPr>
+              <w:spacing w:before="40" w:after="60" w:line="250" w:lineRule="auto"/>
+            </w:pPr>
+            <w:r>
+              <w:rPr>
+                <w:sz w:val="18"/>
+              </w:rPr>
+              <w:t>Moisture, water, oil, corrosive substances, chemicals, dust and external heat affect insulation and sheath life. Select compatible materials and sealing; a larger conductor does not replace environmental suitability.</w:t>
+            </w:r>
+          </w:p>
+        </w:tc>
+      </w:tr>
+      <w:tr>
+        <w:trPr>
+          <w:cantSplit/>
+        </w:trPr>
+        <w:tc>
+          <w:tcPr>
+            <w:tcW w:type="dxa" w:w="2353"/>
+          </w:tcPr>
+          <w:p>
+            <w:pPr>
+              <w:spacing w:before="40" w:after="60" w:line="250" w:lineRule="auto"/>
+            </w:pPr>
+            <w:r>
+              <w:rPr>
+                <w:sz w:val="18"/>
+              </w:rPr>
+              <w:t>Mechanical stresses</w:t>
+              <w:br/>
+              <w:t>机械应力</w:t>
+            </w:r>
+          </w:p>
+        </w:tc>
+        <w:tc>
+          <w:tcPr>
+            <w:tcW w:type="dxa" w:w="3203"/>
+          </w:tcPr>
+          <w:p>
+            <w:pPr>
+              <w:spacing w:before="40" w:after="60" w:line="250" w:lineRule="auto"/>
+            </w:pPr>
+            <w:r>
+              <w:rPr>
+                <w:sz w:val="18"/>
+              </w:rPr>
+              <w:t>冲击、磨损、振动、拉力及移动影响铠装、管槽和支承选择。移动机械应采用适合反复弯曲的电缆；弯曲半径、牵引和固定条件也须满足。</w:t>
+            </w:r>
+          </w:p>
+        </w:tc>
+        <w:tc>
+          <w:tcPr>
+            <w:tcW w:type="dxa" w:w="4876"/>
+          </w:tcPr>
+          <w:p>
+            <w:pPr>
+              <w:spacing w:before="40" w:after="60" w:line="250" w:lineRule="auto"/>
+            </w:pPr>
+            <w:r>
+              <w:rPr>
+                <w:sz w:val="18"/>
+              </w:rPr>
+              <w:t>Impact, abrasion, vibration, tension and movement govern armour, containment and support. Moving machinery needs cables suitable for repeated flexing. Bending, pulling and fixing requirements must also be met.</w:t>
+            </w:r>
+          </w:p>
+        </w:tc>
+      </w:tr>
+      <w:tr>
+        <w:trPr>
+          <w:cantSplit/>
+        </w:trPr>
+        <w:tc>
+          <w:tcPr>
+            <w:tcW w:type="dxa" w:w="2353"/>
+          </w:tcPr>
+          <w:p>
+            <w:pPr>
+              <w:spacing w:before="40" w:after="60" w:line="250" w:lineRule="auto"/>
+            </w:pPr>
+            <w:r>
+              <w:rPr>
+                <w:sz w:val="18"/>
+              </w:rPr>
+              <w:t>Fire and explosion conditions</w:t>
+              <w:br/>
+              <w:t>火灾及爆炸条件</w:t>
+            </w:r>
+          </w:p>
+        </w:tc>
+        <w:tc>
+          <w:tcPr>
+            <w:tcW w:type="dxa" w:w="3203"/>
+          </w:tcPr>
+          <w:p>
+            <w:pPr>
+              <w:spacing w:before="40" w:after="60" w:line="250" w:lineRule="auto"/>
+            </w:pPr>
+            <w:r>
+              <w:rPr>
+                <w:sz w:val="18"/>
+              </w:rPr>
+              <w:t>应考虑火焰蔓延及烟气；消防或应急线路还须考虑火灾时的供电连续性。可燃气体或粉尘区域的电缆、进线装置和布线系统须适合相应危险条件。</w:t>
+            </w:r>
+          </w:p>
+        </w:tc>
+        <w:tc>
+          <w:tcPr>
+            <w:tcW w:type="dxa" w:w="4876"/>
+          </w:tcPr>
+          <w:p>
+            <w:pPr>
+              <w:spacing w:before="40" w:after="60" w:line="250" w:lineRule="auto"/>
+            </w:pPr>
+            <w:r>
+              <w:rPr>
+                <w:sz w:val="18"/>
+              </w:rPr>
+              <w:t>Consider flame spread and smoke, and continuity of supply for fire-service or emergency circuits. In flammable-gas or dust areas, the cable, entries and wiring system must suit the hazardous conditions.</w:t>
+            </w:r>
+          </w:p>
+        </w:tc>
+      </w:tr>
+      <w:tr>
+        <w:trPr>
+          <w:cantSplit/>
+        </w:trPr>
+        <w:tc>
+          <w:tcPr>
+            <w:tcW w:type="dxa" w:w="2353"/>
+          </w:tcPr>
+          <w:p>
+            <w:pPr>
+              <w:spacing w:before="40" w:after="60" w:line="250" w:lineRule="auto"/>
+            </w:pPr>
+            <w:r>
+              <w:rPr>
+                <w:sz w:val="18"/>
+              </w:rPr>
+              <w:t>Terminations and maintenance</w:t>
+              <w:br/>
+              <w:t>端接及维修</w:t>
+            </w:r>
+          </w:p>
+        </w:tc>
+        <w:tc>
+          <w:tcPr>
+            <w:tcW w:type="dxa" w:w="3203"/>
+          </w:tcPr>
+          <w:p>
+            <w:pPr>
+              <w:spacing w:before="40" w:after="60" w:line="250" w:lineRule="auto"/>
+            </w:pPr>
+            <w:r>
+              <w:rPr>
+                <w:sz w:val="18"/>
+              </w:rPr>
+              <w:t>导体材料、截面及外径须与端子、接线耳、格兰头和管槽容量配合。接头接触不良会局部过热；布线应便于检查、测试及更换，并满足端子温度限制。</w:t>
+            </w:r>
+          </w:p>
+        </w:tc>
+        <w:tc>
+          <w:tcPr>
+            <w:tcW w:type="dxa" w:w="4876"/>
+          </w:tcPr>
+          <w:p>
+            <w:pPr>
+              <w:spacing w:before="40" w:after="60" w:line="250" w:lineRule="auto"/>
+            </w:pPr>
+            <w:r>
+              <w:rPr>
+                <w:sz w:val="18"/>
+              </w:rPr>
+              <w:t>Conductor material, size and cable diameter must suit terminals, lugs, glands and enclosure capacity. Poor contacts cause local heating. Provide access for inspection, testing and replacement, and respect terminal temperature limits.</w:t>
+            </w:r>
+          </w:p>
+        </w:tc>
+      </w:tr>
+      <w:tr>
+        <w:trPr>
+          <w:cantSplit/>
+        </w:trPr>
+        <w:tc>
+          <w:tcPr>
+            <w:tcW w:type="dxa" w:w="2353"/>
+          </w:tcPr>
+          <w:p>
+            <w:pPr>
+              <w:spacing w:before="40" w:after="60" w:line="250" w:lineRule="auto"/>
+            </w:pPr>
+            <w:r>
+              <w:rPr>
+                <w:sz w:val="18"/>
+              </w:rPr>
+              <w:t>Power loss and future loading</w:t>
+              <w:br/>
+              <w:t>损耗及未来负荷</w:t>
+            </w:r>
+          </w:p>
+        </w:tc>
+        <w:tc>
+          <w:tcPr>
+            <w:tcW w:type="dxa" w:w="3203"/>
+          </w:tcPr>
+          <w:p>
+            <w:pPr>
+              <w:spacing w:before="40" w:after="60" w:line="250" w:lineRule="auto"/>
+            </w:pPr>
+            <w:r>
+              <w:rPr>
+                <w:sz w:val="18"/>
+              </w:rPr>
+              <w:t>长时间带载的工业线路应考虑I²R损耗和运行费用。合理增大截面可降低电阻及损耗；扩建或新增成组回路后，应重新检查负载、修正系数、压降及保护配合。</w:t>
+            </w:r>
+          </w:p>
+        </w:tc>
+        <w:tc>
+          <w:tcPr>
+            <w:tcW w:type="dxa" w:w="4876"/>
+          </w:tcPr>
+          <w:p>
+            <w:pPr>
+              <w:spacing w:before="40" w:after="60" w:line="250" w:lineRule="auto"/>
+            </w:pPr>
+            <w:r>
+              <w:rPr>
+                <w:sz w:val="18"/>
+              </w:rPr>
+              <w:t>For long operating hours, assess I²R losses and running cost. A larger conductor can reduce resistance and losses. Following expansion or added grouped circuits, reassess loading, corrections, voltage drop and protection coordination.</w:t>
+            </w:r>
+          </w:p>
+        </w:tc>
+      </w:tr>
+    </w:tbl>
+    <w:p>
+      <w:pPr>
+        <w:pStyle w:val="Heading2"/>
+      </w:pPr>
+      <w:r>
+        <w:t>综合选择 / Integrated selection</w:t>
+      </w:r>
+    </w:p>
+    <w:p>
+      <w:r>
+        <w:t>最终规格应同时适合工业环境、保护器件和全部安装条件，并通过压降、故障及损耗检查。若某一条件不满足，应增大截面、改善间距、通风或路线，或选用更适合的电缆结构，再重新核查相关表格和修正系数。</w:t>
+      </w:r>
+    </w:p>
+    <w:p>
+      <w:r>
+        <w:t>The final cable must suit the industrial environment, protective arrangement and all installation conditions, while meeting voltage-drop, fault and loss checks. If a condition is not satisfied, increase size, improve spacing, ventilation or routing, or select a more suitable construction, then recheck the relevant rating and correction data.</w:t>
       </w:r>
     </w:p>
     <w:sectPr>
       <w:headerReference w:type="default" r:id="rId9"/>
       <w:footerReference w:type="default" r:id="rId10"/>
       <w:pgSz w:w="11906" w:h="16838"/>
-      <w:pgMar w:top="765" w:right="765" w:bottom="765" w:left="765" w:header="312" w:footer="312" w:gutter="0"/>
+      <w:pgMar w:top="709" w:right="737" w:bottom="709" w:left="737" w:header="283" w:footer="283" w:gutter="0"/>
       <w:cols w:space="720"/>
       <w:docGrid w:linePitch="360"/>
     </w:sectPr>
@@ -2296,11 +3083,11 @@
     <w:qFormat/>
     <w:rsid w:val="00FC693F"/>
     <w:pPr>
-      <w:spacing w:after="100" w:line="264" w:lineRule="auto"/>
+      <w:spacing w:after="80" w:line="254" w:lineRule="auto"/>
     </w:pPr>
     <w:rPr>
       <w:rFonts w:ascii="Calibri" w:hAnsi="Calibri" w:eastAsia="Noto Sans CJK SC"/>
-      <w:sz w:val="21"/>
+      <w:sz w:val="20"/>
     </w:rPr>
   </w:style>
   <w:style w:type="paragraph" w:styleId="Header">
@@ -2358,7 +3145,7 @@
     <w:pPr>
       <w:keepNext/>
       <w:keepLines/>
-      <w:spacing w:before="480" w:after="140"/>
+      <w:spacing w:before="480" w:after="120"/>
       <w:outlineLvl w:val="0"/>
     </w:pPr>
     <w:rPr>
@@ -2366,7 +3153,7 @@
       <w:b/>
       <w:bCs/>
       <w:color w:val="17364D"/>
-      <w:sz w:val="30"/>
+      <w:sz w:val="28"/>
       <w:szCs w:val="28"/>
     </w:rPr>
   </w:style>
@@ -2382,7 +3169,7 @@
     <w:pPr>
       <w:keepNext/>
       <w:keepLines/>
-      <w:spacing w:before="200" w:after="140"/>
+      <w:spacing w:before="200" w:after="120"/>
       <w:outlineLvl w:val="1"/>
     </w:pPr>
     <w:rPr>
@@ -2390,7 +3177,7 @@
       <w:b/>
       <w:bCs/>
       <w:color w:val="17364D"/>
-      <w:sz w:val="24"/>
+      <w:sz w:val="23"/>
       <w:szCs w:val="26"/>
     </w:rPr>
   </w:style>
@@ -2647,7 +3434,7 @@
       <w:pBdr>
         <w:bottom w:val="single" w:sz="8" w:space="4" w:color="4F81BD" w:themeColor="accent1"/>
       </w:pBdr>
-      <w:spacing w:after="140" w:line="240" w:lineRule="auto"/>
+      <w:spacing w:after="120" w:line="240" w:lineRule="auto"/>
       <w:contextualSpacing/>
     </w:pPr>
     <w:rPr>
@@ -3097,7 +3884,7 @@
       <w:b/>
       <w:bCs/>
       <w:color w:val="4F81BD" w:themeColor="accent1"/>
-      <w:sz w:val="21"/>
+      <w:sz w:val="20"/>
       <w:szCs w:val="18"/>
     </w:rPr>
   </w:style>
@@ -3249,7 +4036,7 @@
     </w:pPr>
     <w:rPr>
       <w:rFonts w:ascii="Calibri" w:hAnsi="Calibri" w:eastAsia="Noto Sans CJK SC"/>
-      <w:sz w:val="21"/>
+      <w:sz w:val="20"/>
     </w:rPr>
     <w:tblPr>
       <w:tblInd w:w="0" w:type="dxa"/>

</xml_diff>